<commit_message>
Complete GJMIGACC functional flow: prerequisites, entry/parallel flow, related SAP reports
Co-Authored-By: Claude Opus 5.5 <noreply@anthropic.com>
Claude-Session: https://claude.ai/code/session_01DECLh5TB1HYcFVtwJhvWoK
</commit_message>
<xml_diff>
--- a/GJMIGACC_Functional_Flow.docx
+++ b/GJMIGACC_Functional_Flow.docx
@@ -2,7 +2,7 @@
 <file path=word/document.xml><?xml version="1.0" encoding="utf-8"?>
 <w:document xmlns:w="http://schemas.openxmlformats.org/wordprocessingml/2006/main" xmlns:m="http://schemas.openxmlformats.org/officeDocument/2006/math" xmlns:r="http://schemas.openxmlformats.org/officeDocument/2006/relationships" xmlns:o="urn:schemas-microsoft-com:office:office" xmlns:v="urn:schemas-microsoft-com:vml" xmlns:w10="urn:schemas-microsoft-com:office:word" xmlns:a="http://schemas.openxmlformats.org/drawingml/2006/main" xmlns:pic="http://schemas.openxmlformats.org/drawingml/2006/picture" xmlns:wp="http://schemas.openxmlformats.org/drawingml/2006/wordprocessingDrawing">
   <w:body>
-    <w:bookmarkStart w:id="31" w:name="X28805089828f0fa18fd2a8031cfbb8d66dbd1fb"/>
+    <w:bookmarkStart w:id="37" w:name="X28805089828f0fa18fd2a8031cfbb8d66dbd1fb"/>
     <w:p>
       <w:pPr>
         <w:pStyle w:val="Heading1"/>
@@ -62,6 +62,21 @@
         <w:t xml:space="preserve"> </w:t>
       </w:r>
       <w:r>
+        <w:t xml:space="preserve">/</w:t>
+      </w:r>
+      <w:r>
+        <w:t xml:space="preserve"> </w:t>
+      </w:r>
+      <w:r>
+        <w:rPr>
+          <w:rStyle w:val="VerbatimChar"/>
+        </w:rPr>
+        <w:t xml:space="preserve">GJMIGACC_c_lass_1.pdf</w:t>
+      </w:r>
+      <w:r>
+        <w:t xml:space="preserve"> </w:t>
+      </w:r>
+      <w:r>
         <w:t xml:space="preserve">(class</w:t>
       </w:r>
       <w:r>
@@ -86,7 +101,143 @@
         <w:t xml:space="preserve">GJVA_MIG</w:t>
       </w:r>
       <w:r>
-        <w:t xml:space="preserve">, system OCP, release 816).</w:t>
+        <w:t xml:space="preserve">,</w:t>
+      </w:r>
+      <w:r>
+        <w:t xml:space="preserve"> </w:t>
+      </w:r>
+      <w:r>
+        <w:t xml:space="preserve">system OCP, release 816). The two class PDFs have identical content; only the print time differs.</w:t>
+      </w:r>
+    </w:p>
+    <w:p>
+      <w:pPr>
+        <w:pStyle w:val="BodyText"/>
+      </w:pPr>
+      <w:r>
+        <w:rPr>
+          <w:bCs/>
+          <w:b/>
+        </w:rPr>
+        <w:t xml:space="preserve">How to read this document:</w:t>
+      </w:r>
+      <w:r>
+        <w:t xml:space="preserve"> </w:t>
+      </w:r>
+      <w:r>
+        <w:t xml:space="preserve">steps marked</w:t>
+      </w:r>
+      <w:r>
+        <w:t xml:space="preserve"> </w:t>
+      </w:r>
+      <w:r>
+        <w:rPr>
+          <w:iCs/>
+          <w:i/>
+        </w:rPr>
+        <w:t xml:space="preserve">(inferred)</w:t>
+      </w:r>
+      <w:r>
+        <w:t xml:space="preserve"> </w:t>
+      </w:r>
+      <w:r>
+        <w:t xml:space="preserve">come from the interface methods</w:t>
+      </w:r>
+      <w:r>
+        <w:t xml:space="preserve"> </w:t>
+      </w:r>
+      <w:r>
+        <w:rPr>
+          <w:rStyle w:val="VerbatimChar"/>
+        </w:rPr>
+        <w:t xml:space="preserve">EXECUTE_PROCESS</w:t>
+      </w:r>
+      <w:r>
+        <w:t xml:space="preserve"> </w:t>
+      </w:r>
+      <w:r>
+        <w:t xml:space="preserve">and</w:t>
+      </w:r>
+      <w:r>
+        <w:t xml:space="preserve"> </w:t>
+      </w:r>
+      <w:r>
+        <w:rPr>
+          <w:rStyle w:val="VerbatimChar"/>
+        </w:rPr>
+        <w:t xml:space="preserve">PARALL_*</w:t>
+      </w:r>
+      <w:r>
+        <w:t xml:space="preserve">, which are not in the class print. They were reconstructed from</w:t>
+      </w:r>
+      <w:r>
+        <w:t xml:space="preserve"> </w:t>
+      </w:r>
+      <w:r>
+        <w:t xml:space="preserve">the private methods that only these interface methods call (</w:t>
+      </w:r>
+      <w:r>
+        <w:rPr>
+          <w:rStyle w:val="VerbatimChar"/>
+        </w:rPr>
+        <w:t xml:space="preserve">GET_GLOBAL_SETTINGS</w:t>
+      </w:r>
+      <w:r>
+        <w:t xml:space="preserve">,</w:t>
+      </w:r>
+      <w:r>
+        <w:t xml:space="preserve"> </w:t>
+      </w:r>
+      <w:r>
+        <w:rPr>
+          <w:rStyle w:val="VerbatimChar"/>
+        </w:rPr>
+        <w:t xml:space="preserve">PROCESS_DATA_PARALLELLY</w:t>
+      </w:r>
+      <w:r>
+        <w:t xml:space="preserve">,</w:t>
+      </w:r>
+      <w:r>
+        <w:t xml:space="preserve"> </w:t>
+      </w:r>
+      <w:r>
+        <w:rPr>
+          <w:rStyle w:val="VerbatimChar"/>
+        </w:rPr>
+        <w:t xml:space="preserve">SAVE_RESULTS</w:t>
+      </w:r>
+      <w:r>
+        <w:t xml:space="preserve">,</w:t>
+      </w:r>
+      <w:r>
+        <w:t xml:space="preserve"> </w:t>
+      </w:r>
+      <w:r>
+        <w:rPr>
+          <w:rStyle w:val="VerbatimChar"/>
+        </w:rPr>
+        <w:t xml:space="preserve">SAVE_RESULTS_GLOBAL</w:t>
+      </w:r>
+      <w:r>
+        <w:t xml:space="preserve">,</w:t>
+      </w:r>
+      <w:r>
+        <w:t xml:space="preserve"> </w:t>
+      </w:r>
+      <w:r>
+        <w:rPr>
+          <w:rStyle w:val="VerbatimChar"/>
+        </w:rPr>
+        <w:t xml:space="preserve">DISPLAY_RESULTS</w:t>
+      </w:r>
+      <w:r>
+        <w:t xml:space="preserve">). Everything</w:t>
+      </w:r>
+      <w:r>
+        <w:t xml:space="preserve"> </w:t>
+      </w:r>
+      <w:r>
+        <w:t xml:space="preserve">else comes directly from the printed source.</w:t>
       </w:r>
     </w:p>
     <w:p>
@@ -2416,13 +2567,446 @@
       </w:r>
     </w:p>
     <w:bookmarkEnd w:id="22"/>
-    <w:bookmarkStart w:id="25" w:name="Xb98607de78467fb6d1d7654dce74a58a8b57f82"/>
+    <w:bookmarkStart w:id="28" w:name="Xb98607de78467fb6d1d7654dce74a58a8b57f82"/>
     <w:p>
       <w:pPr>
         <w:pStyle w:val="Heading2"/>
       </w:pPr>
       <w:r>
         <w:t xml:space="preserve">4. Process flow</w:t>
+      </w:r>
+    </w:p>
+    <w:bookmarkStart w:id="23" w:name="X3258b5f7765f52246add2be8b382e4aba7bbb80"/>
+    <w:p>
+      <w:pPr>
+        <w:pStyle w:val="Heading3"/>
+      </w:pPr>
+      <w:r>
+        <w:t xml:space="preserve">4.0 Prerequisites checked at run time</w:t>
+      </w:r>
+    </w:p>
+    <w:p>
+      <w:pPr>
+        <w:pStyle w:val="FirstParagraph"/>
+      </w:pPr>
+      <w:r>
+        <w:t xml:space="preserve">The run stops with an error if any of these is not met:</w:t>
+      </w:r>
+    </w:p>
+    <w:tbl>
+      <w:tblPr>
+        <w:tblStyle w:val="Table"/>
+        <w:tblW w:type="pct" w:w="5000"/>
+        <w:tblLook w:firstRow="1" w:lastRow="0" w:firstColumn="0" w:lastColumn="0" w:noHBand="0" w:noVBand="0" w:val="0020"/>
+        <w:jc w:val="start"/>
+      </w:tblPr>
+      <w:tblGrid>
+        <w:gridCol w:w="2640"/>
+        <w:gridCol w:w="2640"/>
+        <w:gridCol w:w="2640"/>
+      </w:tblGrid>
+      <w:tr>
+        <w:trPr>
+          <w:tblHeader w:val="true"/>
+        </w:trPr>
+        <w:tc>
+          <w:tcPr/>
+          <w:p>
+            <w:pPr>
+              <w:pStyle w:val="Compact"/>
+              <w:jc w:val="left"/>
+            </w:pPr>
+            <w:r>
+              <w:t xml:space="preserve">Check</w:t>
+            </w:r>
+          </w:p>
+        </w:tc>
+        <w:tc>
+          <w:tcPr/>
+          <w:p>
+            <w:pPr>
+              <w:pStyle w:val="Compact"/>
+              <w:jc w:val="left"/>
+            </w:pPr>
+            <w:r>
+              <w:t xml:space="preserve">Where</w:t>
+            </w:r>
+          </w:p>
+        </w:tc>
+        <w:tc>
+          <w:tcPr/>
+          <w:p>
+            <w:pPr>
+              <w:pStyle w:val="Compact"/>
+              <w:jc w:val="left"/>
+            </w:pPr>
+            <w:r>
+              <w:t xml:space="preserve">Message</w:t>
+            </w:r>
+          </w:p>
+        </w:tc>
+      </w:tr>
+      <w:tr>
+        <w:tc>
+          <w:tcPr/>
+          <w:p>
+            <w:pPr>
+              <w:pStyle w:val="Compact"/>
+              <w:jc w:val="left"/>
+            </w:pPr>
+            <w:r>
+              <w:t xml:space="preserve">At least one selected company code is a JV company code (T8JZ)</w:t>
+            </w:r>
+          </w:p>
+        </w:tc>
+        <w:tc>
+          <w:tcPr/>
+          <w:p>
+            <w:pPr>
+              <w:pStyle w:val="Compact"/>
+              <w:jc w:val="left"/>
+            </w:pPr>
+            <w:r>
+              <w:rPr>
+                <w:rStyle w:val="VerbatimChar"/>
+              </w:rPr>
+              <w:t xml:space="preserve">CHECK_COCODES_AND_AUTHORITIES</w:t>
+            </w:r>
+          </w:p>
+        </w:tc>
+        <w:tc>
+          <w:tcPr/>
+          <w:p>
+            <w:pPr>
+              <w:pStyle w:val="Compact"/>
+              <w:jc w:val="left"/>
+            </w:pPr>
+            <w:r>
+              <w:t xml:space="preserve">G5 802</w:t>
+            </w:r>
+          </w:p>
+        </w:tc>
+      </w:tr>
+      <w:tr>
+        <w:tc>
+          <w:tcPr/>
+          <w:p>
+            <w:pPr>
+              <w:pStyle w:val="Compact"/>
+              <w:jc w:val="left"/>
+            </w:pPr>
+            <w:r>
+              <w:t xml:space="preserve">User has JV process authorisation CUTBACK2, activity 16 (update) or 48 (test/analysis). Company codes without authority are dropped; the run stops only if none are left</w:t>
+            </w:r>
+          </w:p>
+        </w:tc>
+        <w:tc>
+          <w:tcPr/>
+          <w:p>
+            <w:pPr>
+              <w:pStyle w:val="Compact"/>
+              <w:jc w:val="left"/>
+            </w:pPr>
+            <w:r>
+              <w:rPr>
+                <w:rStyle w:val="VerbatimChar"/>
+              </w:rPr>
+              <w:t xml:space="preserve">CHECK_COCODES_AND_AUTHORITIES</w:t>
+            </w:r>
+            <w:r>
+              <w:t xml:space="preserve"> </w:t>
+            </w:r>
+            <w:r>
+              <w:t xml:space="preserve">(</w:t>
+            </w:r>
+            <w:r>
+              <w:rPr>
+                <w:rStyle w:val="VerbatimChar"/>
+              </w:rPr>
+              <w:t xml:space="preserve">JV_AUTHORITY_CHECK_PROCESS</w:t>
+            </w:r>
+            <w:r>
+              <w:t xml:space="preserve">)</w:t>
+            </w:r>
+          </w:p>
+        </w:tc>
+        <w:tc>
+          <w:tcPr/>
+          <w:p>
+            <w:pPr>
+              <w:pStyle w:val="Compact"/>
+              <w:jc w:val="left"/>
+            </w:pPr>
+            <w:r>
+              <w:t xml:space="preserve">G4 292</w:t>
+            </w:r>
+          </w:p>
+        </w:tc>
+      </w:tr>
+      <w:tr>
+        <w:tc>
+          <w:tcPr/>
+          <w:p>
+            <w:pPr>
+              <w:pStyle w:val="Compact"/>
+              <w:jc w:val="left"/>
+            </w:pPr>
+            <w:r>
+              <w:rPr>
+                <w:bCs/>
+                <w:b/>
+              </w:rPr>
+              <w:t xml:space="preserve">Document splitting is active</w:t>
+            </w:r>
+            <w:r>
+              <w:t xml:space="preserve"> </w:t>
+            </w:r>
+            <w:r>
+              <w:t xml:space="preserve">for the company codes</w:t>
+            </w:r>
+          </w:p>
+        </w:tc>
+        <w:tc>
+          <w:tcPr/>
+          <w:p>
+            <w:pPr>
+              <w:pStyle w:val="Compact"/>
+              <w:jc w:val="left"/>
+            </w:pPr>
+            <w:r>
+              <w:rPr>
+                <w:rStyle w:val="VerbatimChar"/>
+              </w:rPr>
+              <w:t xml:space="preserve">GET_SPLIT_CRITERIA</w:t>
+            </w:r>
+            <w:r>
+              <w:t xml:space="preserve"> </w:t>
+            </w:r>
+            <w:r>
+              <w:t xml:space="preserve">(</w:t>
+            </w:r>
+            <w:r>
+              <w:rPr>
+                <w:rStyle w:val="VerbatimChar"/>
+              </w:rPr>
+              <w:t xml:space="preserve">CL_FAGL_SPLIT_SERVICES=&gt;GET_ACTIVE_CC</w:t>
+            </w:r>
+            <w:r>
+              <w:t xml:space="preserve">)</w:t>
+            </w:r>
+          </w:p>
+        </w:tc>
+        <w:tc>
+          <w:tcPr/>
+          <w:p>
+            <w:pPr>
+              <w:pStyle w:val="Compact"/>
+              <w:jc w:val="left"/>
+            </w:pPr>
+            <w:r>
+              <w:t xml:space="preserve">G5 826</w:t>
+            </w:r>
+          </w:p>
+        </w:tc>
+      </w:tr>
+      <w:tr>
+        <w:tc>
+          <w:tcPr/>
+          <w:p>
+            <w:pPr>
+              <w:pStyle w:val="Compact"/>
+              <w:jc w:val="left"/>
+            </w:pPr>
+            <w:r>
+              <w:rPr>
+                <w:bCs/>
+                <w:b/>
+              </w:rPr>
+              <w:t xml:space="preserve">Venture (VNAME) is a document-splitting characteristic</w:t>
+            </w:r>
+            <w:r>
+              <w:t xml:space="preserve"> </w:t>
+            </w:r>
+            <w:r>
+              <w:t xml:space="preserve">(FAGL_SPLIT_FIELD)</w:t>
+            </w:r>
+          </w:p>
+        </w:tc>
+        <w:tc>
+          <w:tcPr/>
+          <w:p>
+            <w:pPr>
+              <w:pStyle w:val="Compact"/>
+              <w:jc w:val="left"/>
+            </w:pPr>
+            <w:r>
+              <w:rPr>
+                <w:rStyle w:val="VerbatimChar"/>
+              </w:rPr>
+              <w:t xml:space="preserve">GET_SPLIT_CRITERIA</w:t>
+            </w:r>
+          </w:p>
+        </w:tc>
+        <w:tc>
+          <w:tcPr/>
+          <w:p>
+            <w:pPr>
+              <w:pStyle w:val="Compact"/>
+              <w:jc w:val="left"/>
+            </w:pPr>
+            <w:r>
+              <w:t xml:space="preserve">G5 827</w:t>
+            </w:r>
+          </w:p>
+        </w:tc>
+      </w:tr>
+      <w:tr>
+        <w:tc>
+          <w:tcPr/>
+          <w:p>
+            <w:pPr>
+              <w:pStyle w:val="Compact"/>
+              <w:jc w:val="left"/>
+            </w:pPr>
+            <w:r>
+              <w:t xml:space="preserve">A server group is entered when parallel processing is on</w:t>
+            </w:r>
+          </w:p>
+        </w:tc>
+        <w:tc>
+          <w:tcPr/>
+          <w:p>
+            <w:pPr>
+              <w:pStyle w:val="Compact"/>
+              <w:jc w:val="left"/>
+            </w:pPr>
+            <w:r>
+              <w:rPr>
+                <w:rStyle w:val="VerbatimChar"/>
+              </w:rPr>
+              <w:t xml:space="preserve">GET_GLOBAL_SETTINGS</w:t>
+            </w:r>
+          </w:p>
+        </w:tc>
+        <w:tc>
+          <w:tcPr/>
+          <w:p>
+            <w:pPr>
+              <w:pStyle w:val="Compact"/>
+              <w:jc w:val="left"/>
+            </w:pPr>
+            <w:r>
+              <w:t xml:space="preserve">SPTA 002</w:t>
+            </w:r>
+          </w:p>
+        </w:tc>
+      </w:tr>
+      <w:tr>
+        <w:tc>
+          <w:tcPr/>
+          <w:p>
+            <w:pPr>
+              <w:pStyle w:val="Compact"/>
+              <w:jc w:val="left"/>
+            </w:pPr>
+            <w:r>
+              <w:t xml:space="preserve">JV settings can be read for the company code</w:t>
+            </w:r>
+          </w:p>
+        </w:tc>
+        <w:tc>
+          <w:tcPr/>
+          <w:p>
+            <w:pPr>
+              <w:pStyle w:val="Compact"/>
+              <w:jc w:val="left"/>
+            </w:pPr>
+            <w:r>
+              <w:rPr>
+                <w:rStyle w:val="VerbatimChar"/>
+              </w:rPr>
+              <w:t xml:space="preserve">GET_COMPANY_CODE_SETTINGS</w:t>
+            </w:r>
+            <w:r>
+              <w:t xml:space="preserve"> </w:t>
+            </w:r>
+            <w:r>
+              <w:t xml:space="preserve">(</w:t>
+            </w:r>
+            <w:r>
+              <w:rPr>
+                <w:rStyle w:val="VerbatimChar"/>
+              </w:rPr>
+              <w:t xml:space="preserve">CL_JVA_SETTINGS</w:t>
+            </w:r>
+            <w:r>
+              <w:t xml:space="preserve">)</w:t>
+            </w:r>
+          </w:p>
+        </w:tc>
+        <w:tc>
+          <w:tcPr/>
+          <w:p>
+            <w:pPr>
+              <w:pStyle w:val="Compact"/>
+              <w:jc w:val="left"/>
+            </w:pPr>
+            <w:r>
+              <w:t xml:space="preserve">GI 701 (that company code is skipped)</w:t>
+            </w:r>
+          </w:p>
+        </w:tc>
+      </w:tr>
+      <w:tr>
+        <w:tc>
+          <w:tcPr/>
+          <w:p>
+            <w:pPr>
+              <w:pStyle w:val="Compact"/>
+              <w:jc w:val="left"/>
+            </w:pPr>
+            <w:r>
+              <w:t xml:space="preserve">More than 100,000 JV documents in a dialog run</w:t>
+            </w:r>
+          </w:p>
+        </w:tc>
+        <w:tc>
+          <w:tcPr/>
+          <w:p>
+            <w:pPr>
+              <w:pStyle w:val="Compact"/>
+              <w:jc w:val="left"/>
+            </w:pPr>
+            <w:r>
+              <w:rPr>
+                <w:rStyle w:val="VerbatimChar"/>
+              </w:rPr>
+              <w:t xml:space="preserve">GET_GLOBAL_SETTINGS</w:t>
+            </w:r>
+          </w:p>
+        </w:tc>
+        <w:tc>
+          <w:tcPr/>
+          <w:p>
+            <w:pPr>
+              <w:pStyle w:val="Compact"/>
+              <w:jc w:val="left"/>
+            </w:pPr>
+            <w:r>
+              <w:t xml:space="preserve">Confirmation popup; "No" cancels</w:t>
+            </w:r>
+          </w:p>
+        </w:tc>
+      </w:tr>
+    </w:tbl>
+    <w:bookmarkEnd w:id="23"/>
+    <w:bookmarkStart w:id="24" w:name="X3faa057747c10463802885e50b030aeaac14213"/>
+    <w:p>
+      <w:pPr>
+        <w:pStyle w:val="Heading3"/>
+      </w:pPr>
+      <w:r>
+        <w:t xml:space="preserve">4.1 Overall call flow</w:t>
       </w:r>
     </w:p>
     <w:p>
@@ -2490,7 +3074,7 @@
           <w:sz w:val="13"/>
           <w:szCs w:val="13"/>
         </w:rPr>
-        <w:t xml:space="preserve">        └─ CL_JVA_MIG_CORRECT_ACDOCA=&gt;get_instance( )-&gt;execute_process( params )</w:t>
+        <w:t xml:space="preserve">        └─ CL_JVA_MIG_CORRECT_ACDOCA=&gt;get_instance( )-&gt;execute_process( params )   (inferred body)</w:t>
       </w:r>
       <w:r>
         <w:br/>
@@ -2501,7 +3085,7 @@
           <w:sz w:val="13"/>
           <w:szCs w:val="13"/>
         </w:rPr>
-        <w:t xml:space="preserve">              │</w:t>
+        <w:t xml:space="preserve">              │   store params in MS_PROGPARS</w:t>
       </w:r>
       <w:r>
         <w:br/>
@@ -2512,7 +3096,7 @@
           <w:sz w:val="13"/>
           <w:szCs w:val="13"/>
         </w:rPr>
-        <w:t xml:space="preserve">              ├─ GET_GLOBAL_SETTINGS</w:t>
+        <w:t xml:space="preserve">              │</w:t>
       </w:r>
       <w:r>
         <w:br/>
@@ -2523,7 +3107,7 @@
           <w:sz w:val="13"/>
           <w:szCs w:val="13"/>
         </w:rPr>
-        <w:t xml:space="preserve">              │    ├─ CHECK_COCODES_AND_AUTHORITIES</w:t>
+        <w:t xml:space="preserve">              ├─ GET_GLOBAL_SETTINGS              (error → skip to DISPLAY_RESULTS with the messages)</w:t>
       </w:r>
       <w:r>
         <w:br/>
@@ -2534,7 +3118,7 @@
           <w:sz w:val="13"/>
           <w:szCs w:val="13"/>
         </w:rPr>
-        <w:t xml:space="preserve">              │    │     • company codes = T8JZ ∩ S_BUKRS (none → error G5 802)</w:t>
+        <w:t xml:space="preserve">              │    ├─ CHECK_COCODES_AND_AUTHORITIES</w:t>
       </w:r>
       <w:r>
         <w:br/>
@@ -2545,7 +3129,7 @@
           <w:sz w:val="13"/>
           <w:szCs w:val="13"/>
         </w:rPr>
-        <w:t xml:space="preserve">              │    │     • JV_AUTHORITY_CHECK_PROCESS, process CUTBACK2,</w:t>
+        <w:t xml:space="preserve">              │    │     • company codes = T8JZ ∩ S_BUKRS (none → error G5 802)</w:t>
       </w:r>
       <w:r>
         <w:br/>
@@ -2556,7 +3140,7 @@
           <w:sz w:val="13"/>
           <w:szCs w:val="13"/>
         </w:rPr>
-        <w:t xml:space="preserve">              │    │       activity 16 (update) or 48 (test/analysis); drops unauthorised company codes</w:t>
+        <w:t xml:space="preserve">              │    │     • JV_AUTHORITY_CHECK_PROCESS, process CUTBACK2,</w:t>
       </w:r>
       <w:r>
         <w:br/>
@@ -2567,7 +3151,7 @@
           <w:sz w:val="13"/>
           <w:szCs w:val="13"/>
         </w:rPr>
-        <w:t xml:space="preserve">              │    │     • JV_GET_LEDGER → JV leading ledger</w:t>
+        <w:t xml:space="preserve">              │    │       activity 16 (update) or 48 (test/analysis); drops unauthorised company codes</w:t>
       </w:r>
       <w:r>
         <w:br/>
@@ -2578,7 +3162,7 @@
           <w:sz w:val="13"/>
           <w:szCs w:val="13"/>
         </w:rPr>
-        <w:t xml:space="preserve">              │    ├─ GET_SPLIT_CRITERIA (FAGL splitter active? FAGL_SPLIT_FIELD)</w:t>
+        <w:t xml:space="preserve">              │    │     • JV_GET_LEDGER → JV leading ledger</w:t>
       </w:r>
       <w:r>
         <w:br/>
@@ -2589,7 +3173,7 @@
           <w:sz w:val="13"/>
           <w:szCs w:val="13"/>
         </w:rPr>
-        <w:t xml:space="preserve">              │    ├─ default/validate bulk &amp; parallel sizes</w:t>
+        <w:t xml:space="preserve">              │    ├─ GET_SPLIT_CRITERIA (doc splitting active? VNAME a split field? else G5 826/827)</w:t>
       </w:r>
       <w:r>
         <w:br/>
@@ -2600,7 +3184,7 @@
           <w:sz w:val="13"/>
           <w:szCs w:val="13"/>
         </w:rPr>
-        <w:t xml:space="preserve">              │    ├─ PREPARE_PERIOD_RANGE (no period entered → 001–012)</w:t>
+        <w:t xml:space="preserve">              │    ├─ default/validate bulk &amp; parallel sizes</w:t>
       </w:r>
       <w:r>
         <w:br/>
@@ -2611,7 +3195,7 @@
           <w:sz w:val="13"/>
           <w:szCs w:val="13"/>
         </w:rPr>
-        <w:t xml:space="preserve">              │    ├─ PREPARE_ACTIVITY_RANGE_FI_CO (FI: fi_doc + fi_doc_mm, CO: co_doc)</w:t>
+        <w:t xml:space="preserve">              │    ├─ PREPARE_PERIOD_RANGE (no period entered → 001–012)</w:t>
       </w:r>
       <w:r>
         <w:br/>
@@ -2622,7 +3206,7 @@
           <w:sz w:val="13"/>
           <w:szCs w:val="13"/>
         </w:rPr>
-        <w:t xml:space="preserve">              │    ├─ dialog only: COUNT_JV_DOCUMENTS_TOTAL &gt; 100,000 → "run in foreground?" popup</w:t>
+        <w:t xml:space="preserve">              │    ├─ PREPARE_ACTIVITY_RANGE_FI_CO (FI: fi_doc + fi_doc_mm, CO: co_doc)</w:t>
       </w:r>
       <w:r>
         <w:br/>
@@ -2633,7 +3217,7 @@
           <w:sz w:val="13"/>
           <w:szCs w:val="13"/>
         </w:rPr>
-        <w:t xml:space="preserve">              │    └─ decide spool output (batch, or spool per task)</w:t>
+        <w:t xml:space="preserve">              │    ├─ dialog only: COUNT_JV_DOCUMENTS_TOTAL &gt; 100,000 → "run in foreground?" popup</w:t>
       </w:r>
       <w:r>
         <w:br/>
@@ -2644,7 +3228,7 @@
           <w:sz w:val="13"/>
           <w:szCs w:val="13"/>
         </w:rPr>
-        <w:t xml:space="preserve">              │</w:t>
+        <w:t xml:space="preserve">              │    └─ decide spool output (batch, or spool per task)</w:t>
       </w:r>
       <w:r>
         <w:br/>
@@ -2655,7 +3239,7 @@
           <w:sz w:val="13"/>
           <w:szCs w:val="13"/>
         </w:rPr>
-        <w:t xml:space="preserve">              ├─ Parallel?  PROCESS_DATA_PARALLELLY</w:t>
+        <w:t xml:space="preserve">              │</w:t>
       </w:r>
       <w:r>
         <w:br/>
@@ -2666,7 +3250,7 @@
           <w:sz w:val="13"/>
           <w:szCs w:val="13"/>
         </w:rPr>
-        <w:t xml:space="preserve">              │      • CALCULATE_TASK_PACKAGES per company code (packages by year/period, ~P_DOCTSK docs each)</w:t>
+        <w:t xml:space="preserve">              ├─ Parallel?  PROCESS_DATA_PARALLELLY</w:t>
       </w:r>
       <w:r>
         <w:br/>
@@ -2677,7 +3261,7 @@
           <w:sz w:val="13"/>
           <w:szCs w:val="13"/>
         </w:rPr>
-        <w:t xml:space="preserve">              │      • ≤ 1 package → falls back to synchronous</w:t>
+        <w:t xml:space="preserve">              │      • CALCULATE_TASK_PACKAGES per company code (packages by year/period, ~P_DOCTSK docs each)</w:t>
       </w:r>
       <w:r>
         <w:br/>
@@ -2688,7 +3272,7 @@
           <w:sz w:val="13"/>
           <w:szCs w:val="13"/>
         </w:rPr>
-        <w:t xml:space="preserve">              │      • SPTA_PARA_PROCESS_START_2 → FORM BEFORE_RFC / IN_RFC / AFTER_RFC in the report</w:t>
+        <w:t xml:space="preserve">              │      • ≤ 1 package → falls back to synchronous</w:t>
       </w:r>
       <w:r>
         <w:br/>
@@ -2699,7 +3283,7 @@
           <w:sz w:val="13"/>
           <w:szCs w:val="13"/>
         </w:rPr>
-        <w:t xml:space="preserve">              │        (each task runs PROCESS_COMPANY_CODE for its periods)</w:t>
+        <w:t xml:space="preserve">              │      • SPTA_PARA_PROCESS_START_2 → FORM BEFORE_RFC / IN_RFC / AFTER_RFC in the report</w:t>
       </w:r>
       <w:r>
         <w:br/>
@@ -2710,7 +3294,7 @@
           <w:sz w:val="13"/>
           <w:szCs w:val="13"/>
         </w:rPr>
-        <w:t xml:space="preserve">              │  else PROCESS_DATA_SYNCHRONOUSLY → loop company codes → PROCESS_COMPANY_CODE</w:t>
+        <w:t xml:space="preserve">              │        (each task runs PROCESS_COMPANY_CODE for its periods; see 4.4)</w:t>
       </w:r>
       <w:r>
         <w:br/>
@@ -2721,7 +3305,7 @@
           <w:sz w:val="13"/>
           <w:szCs w:val="13"/>
         </w:rPr>
-        <w:t xml:space="preserve">              │</w:t>
+        <w:t xml:space="preserve">              │  else PROCESS_DATA_SYNCHRONOUSLY → loop company codes → PROCESS_COMPANY_CODE</w:t>
       </w:r>
       <w:r>
         <w:br/>
@@ -2732,7 +3316,7 @@
           <w:sz w:val="13"/>
           <w:szCs w:val="13"/>
         </w:rPr>
-        <w:t xml:space="preserve">              └─ PROCESS_COMPANY_CODE (per company code)</w:t>
+        <w:t xml:space="preserve">              │        (print a spool per company code in background; SAVE_RESULTS)</w:t>
       </w:r>
       <w:r>
         <w:br/>
@@ -2743,7 +3327,7 @@
           <w:sz w:val="13"/>
           <w:szCs w:val="13"/>
         </w:rPr>
-        <w:t xml:space="preserve">                   ├─ GET_COMPANY_CODE_SETTINGS</w:t>
+        <w:t xml:space="preserve">              │</w:t>
       </w:r>
       <w:r>
         <w:br/>
@@ -2754,7 +3338,7 @@
           <w:sz w:val="13"/>
           <w:szCs w:val="13"/>
         </w:rPr>
-        <w:t xml:space="preserve">                   │     • CL_JVA_SETTINGS (T8JZ), NewGL split active? (T8JZ_FAGL + FI_SPLIT_ACTIVATION)</w:t>
+        <w:t xml:space="preserve">              │  PROCESS_COMPANY_CODE (per company code or task)</w:t>
       </w:r>
       <w:r>
         <w:br/>
@@ -2765,7 +3349,7 @@
           <w:sz w:val="13"/>
           <w:szCs w:val="13"/>
         </w:rPr>
-        <w:t xml:space="preserve">                   │     • GET_LEDGERS: JV ledger, or all ledgers in FINSC_LD_CMP</w:t>
+        <w:t xml:space="preserve">              │     ├─ GET_COMPANY_CODE_SETTINGS</w:t>
       </w:r>
       <w:r>
         <w:br/>
@@ -2776,7 +3360,7 @@
           <w:sz w:val="13"/>
           <w:szCs w:val="13"/>
         </w:rPr>
-        <w:t xml:space="preserve">                   │       (also UPDATE JVA_ACD_UPD_LOG set RLDNR_ACD + COMMIT)</w:t>
+        <w:t xml:space="preserve">              │     │     • CL_JVA_SETTINGS (T8JZ), NewGL split active? (T8JZ_FAGL + FI_SPLIT_ACTIVATION)</w:t>
       </w:r>
       <w:r>
         <w:br/>
@@ -2787,7 +3371,7 @@
           <w:sz w:val="13"/>
           <w:szCs w:val="13"/>
         </w:rPr>
-        <w:t xml:space="preserve">                   │     • currencies (GL and classic JV)</w:t>
+        <w:t xml:space="preserve">              │     │     • GET_LEDGERS: JV ledger, or all ledgers in FINSC_LD_CMP</w:t>
       </w:r>
       <w:r>
         <w:br/>
@@ -2798,7 +3382,7 @@
           <w:sz w:val="13"/>
           <w:szCs w:val="13"/>
         </w:rPr>
-        <w:t xml:space="preserve">                   │     • migrated docs present? (ACDOCA-MIG_SOURCE; 'J' = JV migrated)</w:t>
+        <w:t xml:space="preserve">              │     │       (also UPDATE JVA_ACD_UPD_LOG set RLDNR_ACD + COMMIT)</w:t>
       </w:r>
       <w:r>
         <w:br/>
@@ -2809,7 +3393,7 @@
           <w:sz w:val="13"/>
           <w:szCs w:val="13"/>
         </w:rPr>
-        <w:t xml:space="preserve">                   ├─ RETRIEVE_AND_PROCESS_DATA        (see 4.1)</w:t>
+        <w:t xml:space="preserve">              │     │     • currencies (GL and classic JV)</w:t>
       </w:r>
       <w:r>
         <w:br/>
@@ -2820,7 +3404,7 @@
           <w:sz w:val="13"/>
           <w:szCs w:val="13"/>
         </w:rPr>
-        <w:t xml:space="preserve">                   └─ UPDATE_LOG_DB_TABLE              (flush JVA_ACD_UPD_LOG + COMMIT)</w:t>
+        <w:t xml:space="preserve">              │     │     • migrated docs present? (ACDOCA-MIG_SOURCE; 'J' = JV migrated)</w:t>
       </w:r>
       <w:r>
         <w:br/>
@@ -2831,16 +3415,94 @@
           <w:sz w:val="13"/>
           <w:szCs w:val="13"/>
         </w:rPr>
+        <w:t xml:space="preserve">              │     ├─ RETRIEVE_AND_PROCESS_DATA        (see 4.2)</w:t>
+      </w:r>
+      <w:r>
+        <w:br/>
+      </w:r>
+      <w:r>
+        <w:rPr>
+          <w:rStyle w:val="VerbatimChar"/>
+          <w:sz w:val="13"/>
+          <w:szCs w:val="13"/>
+        </w:rPr>
+        <w:t xml:space="preserve">              │     └─ UPDATE_LOG_DB_TABLE              (flush JVA_ACD_UPD_LOG + COMMIT)</w:t>
+      </w:r>
+      <w:r>
+        <w:br/>
+      </w:r>
+      <w:r>
+        <w:rPr>
+          <w:rStyle w:val="VerbatimChar"/>
+          <w:sz w:val="13"/>
+          <w:szCs w:val="13"/>
+        </w:rPr>
+        <w:t xml:space="preserve">              │</w:t>
+      </w:r>
+      <w:r>
+        <w:br/>
+      </w:r>
+      <w:r>
+        <w:rPr>
+          <w:rStyle w:val="VerbatimChar"/>
+          <w:sz w:val="13"/>
+          <w:szCs w:val="13"/>
+        </w:rPr>
+        <w:t xml:space="preserve">              ├─ SAVE_RESULTS_GLOBAL      (inferred call) totals over all company codes and tasks,</w:t>
+      </w:r>
+      <w:r>
+        <w:br/>
+      </w:r>
+      <w:r>
+        <w:rPr>
+          <w:rStyle w:val="VerbatimChar"/>
+          <w:sz w:val="13"/>
+          <w:szCs w:val="13"/>
+        </w:rPr>
+        <w:t xml:space="preserve">              │                            CALCULATE_GLOBAL_RUNTIMES, overall spool if printing</w:t>
+      </w:r>
+      <w:r>
+        <w:br/>
+      </w:r>
+      <w:r>
+        <w:rPr>
+          <w:rStyle w:val="VerbatimChar"/>
+          <w:sz w:val="13"/>
+          <w:szCs w:val="13"/>
+        </w:rPr>
+        <w:t xml:space="preserve">              └─ DISPLAY_RESULTS          (inferred call) nothing found → message GI 708;</w:t>
+      </w:r>
+      <w:r>
+        <w:br/>
+      </w:r>
+      <w:r>
+        <w:rPr>
+          <w:rStyle w:val="VerbatimChar"/>
+          <w:sz w:val="13"/>
+          <w:szCs w:val="13"/>
+        </w:rPr>
+        <w:t xml:space="preserve">                                           spool mode → DISPLAY_SPOOLS; else ALV for 1 or n company codes</w:t>
+      </w:r>
+      <w:r>
+        <w:br/>
+      </w:r>
+      <w:r>
+        <w:rPr>
+          <w:rStyle w:val="VerbatimChar"/>
+          <w:sz w:val="13"/>
+          <w:szCs w:val="13"/>
+        </w:rPr>
         <w:t xml:space="preserve">        Output: CL_JVA_MIG_ALV_OUTPUT (ALV, or spool; AT LINE-SELECTION shows a spool)</w:t>
       </w:r>
     </w:p>
-    <w:bookmarkStart w:id="23" w:name="X72bd5e853f727db4a90457eb1cd279e21709d9a"/>
+    <w:bookmarkEnd w:id="24"/>
+    <w:bookmarkStart w:id="25" w:name="X832ecfe41ee022b0bbc788eb876735392534608"/>
     <w:p>
       <w:pPr>
         <w:pStyle w:val="Heading3"/>
       </w:pPr>
       <w:r>
-        <w:t xml:space="preserve">4.1 RETRIEVE_AND_PROCESS_DATA (per company code, in bulks)</w:t>
+        <w:t xml:space="preserve">4.2 RETRIEVE_AND_PROCESS_DATA (per company code, in bulks)</w:t>
       </w:r>
     </w:p>
     <w:p>
@@ -2990,7 +3652,120 @@
         <w:t xml:space="preserve"> </w:t>
       </w:r>
       <w:r>
-        <w:t xml:space="preserve">(BKPF/COBK header data)</w:t>
+        <w:t xml:space="preserve">reads BKPF (AWKEY, GLVOR, TCODE, BSTAT, BKTXT) and COBK, then</w:t>
+      </w:r>
+      <w:r>
+        <w:t xml:space="preserve"> </w:t>
+      </w:r>
+      <w:r>
+        <w:t xml:space="preserve">decides what each JV document really is:</w:t>
+      </w:r>
+    </w:p>
+    <w:p>
+      <w:pPr>
+        <w:numPr>
+          <w:ilvl w:val="2"/>
+          <w:numId w:val="1004"/>
+        </w:numPr>
+        <w:pStyle w:val="Compact"/>
+      </w:pPr>
+      <w:r>
+        <w:t xml:space="preserve">Documents created by JV internal transactions (TCODE or BKTXT starting with</w:t>
+      </w:r>
+      <w:r>
+        <w:t xml:space="preserve"> </w:t>
+      </w:r>
+      <w:r>
+        <w:rPr>
+          <w:bCs/>
+          <w:b/>
+        </w:rPr>
+        <w:t xml:space="preserve">GJEC, GJ19, GJ17,</w:t>
+      </w:r>
+      <w:r>
+        <w:rPr>
+          <w:bCs/>
+          <w:b/>
+        </w:rPr>
+        <w:t xml:space="preserve"> </w:t>
+      </w:r>
+      <w:r>
+        <w:rPr>
+          <w:bCs/>
+          <w:b/>
+        </w:rPr>
+        <w:t xml:space="preserve">GJFARM</w:t>
+      </w:r>
+      <w:r>
+        <w:t xml:space="preserve">: equity change, cutback, cash call, farm-in/out) are</w:t>
+      </w:r>
+      <w:r>
+        <w:t xml:space="preserve"> </w:t>
+      </w:r>
+      <w:r>
+        <w:rPr>
+          <w:bCs/>
+          <w:b/>
+        </w:rPr>
+        <w:t xml:space="preserve">not</w:t>
+      </w:r>
+      <w:r>
+        <w:t xml:space="preserve"> </w:t>
+      </w:r>
+      <w:r>
+        <w:t xml:space="preserve">treated as normal FI documents.</w:t>
+      </w:r>
+      <w:r>
+        <w:t xml:space="preserve"> </w:t>
+      </w:r>
+      <w:r>
+        <w:t xml:space="preserve">For FI-line types they are dropped from this run.</w:t>
+      </w:r>
+    </w:p>
+    <w:p>
+      <w:pPr>
+        <w:numPr>
+          <w:ilvl w:val="2"/>
+          <w:numId w:val="1004"/>
+        </w:numPr>
+        <w:pStyle w:val="Compact"/>
+      </w:pPr>
+      <w:r>
+        <w:t xml:space="preserve">A JV CO line whose FI header has GLVOR =</w:t>
+      </w:r>
+      <w:r>
+        <w:t xml:space="preserve"> </w:t>
+      </w:r>
+      <w:r>
+        <w:rPr>
+          <w:bCs/>
+          <w:b/>
+        </w:rPr>
+        <w:t xml:space="preserve">COFI</w:t>
+      </w:r>
+      <w:r>
+        <w:t xml:space="preserve"> </w:t>
+      </w:r>
+      <w:r>
+        <w:t xml:space="preserve">has a wrong REFFIDOC and is dropped.</w:t>
+      </w:r>
+      <w:r>
+        <w:t xml:space="preserve"> </w:t>
+      </w:r>
+      <w:r>
+        <w:t xml:space="preserve">Otherwise it is re-classified as an FI document.</w:t>
+      </w:r>
+    </w:p>
+    <w:p>
+      <w:pPr>
+        <w:numPr>
+          <w:ilvl w:val="2"/>
+          <w:numId w:val="1004"/>
+        </w:numPr>
+        <w:pStyle w:val="Compact"/>
+      </w:pPr>
+      <w:r>
+        <w:t xml:space="preserve">If the controlling area is missing, it is taken from TKA02.</w:t>
       </w:r>
     </w:p>
     <w:p>
@@ -3011,7 +3786,58 @@
         <w:t xml:space="preserve"> </w:t>
       </w:r>
       <w:r>
-        <w:t xml:space="preserve">reads the full JVSO1 lines and the preceding-document references</w:t>
+        <w:t xml:space="preserve">reads the full JVSO1 lines (ledger 4A, plus 4C when JV classic currencies</w:t>
+      </w:r>
+      <w:r>
+        <w:t xml:space="preserve"> </w:t>
+      </w:r>
+      <w:r>
+        <w:t xml:space="preserve">3/4 are used) and merges 4A with 4C (</w:t>
+      </w:r>
+      <w:r>
+        <w:rPr>
+          <w:rStyle w:val="VerbatimChar"/>
+        </w:rPr>
+        <w:t xml:space="preserve">COMBINE_AND_ANALYZE_JV_LINES</w:t>
+      </w:r>
+      <w:r>
+        <w:t xml:space="preserve">). It also collects the</w:t>
+      </w:r>
+      <w:r>
+        <w:t xml:space="preserve"> </w:t>
+      </w:r>
+      <w:r>
+        <w:t xml:space="preserve">preceding-document references used for the</w:t>
+      </w:r>
+      <w:r>
+        <w:t xml:space="preserve"> </w:t>
+      </w:r>
+      <w:r>
+        <w:rPr>
+          <w:rStyle w:val="VerbatimChar"/>
+        </w:rPr>
+        <w:t xml:space="preserve">IN</w:t>
+      </w:r>
+      <w:r>
+        <w:t xml:space="preserve"> </w:t>
+      </w:r>
+      <w:r>
+        <w:t xml:space="preserve">and</w:t>
+      </w:r>
+      <w:r>
+        <w:t xml:space="preserve"> </w:t>
+      </w:r>
+      <w:r>
+        <w:rPr>
+          <w:rStyle w:val="VerbatimChar"/>
+        </w:rPr>
+        <w:t xml:space="preserve">MI</w:t>
+      </w:r>
+      <w:r>
+        <w:t xml:space="preserve"> </w:t>
+      </w:r>
+      <w:r>
+        <w:t xml:space="preserve">searches below.</w:t>
       </w:r>
     </w:p>
     <w:p>
@@ -3043,6 +3869,24 @@
         </w:rPr>
         <w:t xml:space="preserve">JVA_ACD_UPD_LOG</w:t>
       </w:r>
+      <w:r>
+        <w:t xml:space="preserve"> </w:t>
+      </w:r>
+      <w:r>
+        <w:t xml:space="preserve">(</w:t>
+      </w:r>
+      <w:r>
+        <w:rPr>
+          <w:rStyle w:val="VerbatimChar"/>
+        </w:rPr>
+        <w:t xml:space="preserve">GJAHR_NEW</w:t>
+      </w:r>
+      <w:r>
+        <w:t xml:space="preserve"> </w:t>
+      </w:r>
+      <w:r>
+        <w:t xml:space="preserve">≠ JV year). These are re-read so a second run does not correct the same document twice.</w:t>
+      </w:r>
     </w:p>
     <w:p>
       <w:pPr>
@@ -3069,7 +3913,7 @@
       <w:pPr>
         <w:numPr>
           <w:ilvl w:val="2"/>
-          <w:numId w:val="1004"/>
+          <w:numId w:val="1005"/>
         </w:numPr>
         <w:pStyle w:val="Compact"/>
       </w:pPr>
@@ -3096,7 +3940,7 @@
       <w:pPr>
         <w:numPr>
           <w:ilvl w:val="2"/>
-          <w:numId w:val="1004"/>
+          <w:numId w:val="1005"/>
         </w:numPr>
         <w:pStyle w:val="Compact"/>
       </w:pPr>
@@ -3123,7 +3967,7 @@
       <w:pPr>
         <w:numPr>
           <w:ilvl w:val="2"/>
-          <w:numId w:val="1004"/>
+          <w:numId w:val="1005"/>
         </w:numPr>
         <w:pStyle w:val="Compact"/>
       </w:pPr>
@@ -3165,7 +4009,7 @@
       <w:pPr>
         <w:numPr>
           <w:ilvl w:val="2"/>
-          <w:numId w:val="1004"/>
+          <w:numId w:val="1005"/>
         </w:numPr>
         <w:pStyle w:val="Compact"/>
       </w:pPr>
@@ -3210,7 +4054,7 @@
       <w:pPr>
         <w:numPr>
           <w:ilvl w:val="2"/>
-          <w:numId w:val="1004"/>
+          <w:numId w:val="1005"/>
         </w:numPr>
         <w:pStyle w:val="Compact"/>
       </w:pPr>
@@ -3228,7 +4072,7 @@
       <w:pPr>
         <w:numPr>
           <w:ilvl w:val="2"/>
-          <w:numId w:val="1004"/>
+          <w:numId w:val="1005"/>
         </w:numPr>
         <w:pStyle w:val="Compact"/>
       </w:pPr>
@@ -3269,21 +4113,21 @@
         <w:t xml:space="preserve">COMPARE_AND_CORRECT_DOCUMENTS</w:t>
       </w:r>
     </w:p>
-    <w:bookmarkEnd w:id="23"/>
-    <w:bookmarkStart w:id="24" w:name="Xb5c9524ef762400663d55e621f59d52835d7488"/>
+    <w:bookmarkEnd w:id="25"/>
+    <w:bookmarkStart w:id="26" w:name="Xe44174093251fca774f8099efdbd741e2494beb"/>
     <w:p>
       <w:pPr>
         <w:pStyle w:val="Heading3"/>
       </w:pPr>
       <w:r>
-        <w:t xml:space="preserve">4.2 COMPARE_AND_CORRECT_DOCUMENTS (per JV document group × ledger)</w:t>
+        <w:t xml:space="preserve">4.3 COMPARE_AND_CORRECT_DOCUMENTS (per JV document group × ledger)</w:t>
       </w:r>
     </w:p>
     <w:p>
       <w:pPr>
         <w:numPr>
           <w:ilvl w:val="0"/>
-          <w:numId w:val="1005"/>
+          <w:numId w:val="1006"/>
         </w:numPr>
       </w:pPr>
       <w:r>
@@ -3298,113 +4142,6 @@
       </w:r>
       <w:r>
         <w:t xml:space="preserve">The program ignores:</w:t>
-      </w:r>
-    </w:p>
-    <w:p>
-      <w:pPr>
-        <w:numPr>
-          <w:ilvl w:val="1"/>
-          <w:numId w:val="1006"/>
-        </w:numPr>
-        <w:pStyle w:val="Compact"/>
-      </w:pPr>
-      <w:r>
-        <w:t xml:space="preserve">zero-amount lines</w:t>
-      </w:r>
-    </w:p>
-    <w:p>
-      <w:pPr>
-        <w:numPr>
-          <w:ilvl w:val="1"/>
-          <w:numId w:val="1006"/>
-        </w:numPr>
-        <w:pStyle w:val="Compact"/>
-      </w:pPr>
-      <w:r>
-        <w:t xml:space="preserve">balancing lines, if</w:t>
-      </w:r>
-      <w:r>
-        <w:t xml:space="preserve"> </w:t>
-      </w:r>
-      <w:r>
-        <w:rPr>
-          <w:rStyle w:val="VerbatimChar"/>
-        </w:rPr>
-        <w:t xml:space="preserve">P_EXCLBL</w:t>
-      </w:r>
-      <w:r>
-        <w:t xml:space="preserve"> </w:t>
-      </w:r>
-      <w:r>
-        <w:t xml:space="preserve">is set</w:t>
-      </w:r>
-    </w:p>
-    <w:p>
-      <w:pPr>
-        <w:numPr>
-          <w:ilvl w:val="1"/>
-          <w:numId w:val="1006"/>
-        </w:numPr>
-        <w:pStyle w:val="Compact"/>
-      </w:pPr>
-      <w:r>
-        <w:t xml:space="preserve">FI/CO lines without a reference</w:t>
-      </w:r>
-    </w:p>
-    <w:p>
-      <w:pPr>
-        <w:numPr>
-          <w:ilvl w:val="0"/>
-          <w:numId w:val="1000"/>
-        </w:numPr>
-      </w:pPr>
-      <w:r>
-        <w:t xml:space="preserve">For FI/CO documents it also accumulates JV balances (</w:t>
-      </w:r>
-      <w:r>
-        <w:rPr>
-          <w:rStyle w:val="VerbatimChar"/>
-        </w:rPr>
-        <w:t xml:space="preserve">PREPARE_JVSO_BALANCES</w:t>
-      </w:r>
-      <w:r>
-        <w:t xml:space="preserve">).</w:t>
-      </w:r>
-      <w:r>
-        <w:t xml:space="preserve"> </w:t>
-      </w:r>
-      <w:r>
-        <w:rPr>
-          <w:rStyle w:val="VerbatimChar"/>
-        </w:rPr>
-        <w:t xml:space="preserve">DETERMINE_JV_DOC_TYPE</w:t>
-      </w:r>
-      <w:r>
-        <w:t xml:space="preserve"> </w:t>
-      </w:r>
-      <w:r>
-        <w:t xml:space="preserve">sets the document type (FI doc / CO doc) from ACTIV.</w:t>
-      </w:r>
-    </w:p>
-    <w:p>
-      <w:pPr>
-        <w:numPr>
-          <w:ilvl w:val="0"/>
-          <w:numId w:val="1005"/>
-        </w:numPr>
-      </w:pPr>
-      <w:r>
-        <w:rPr>
-          <w:bCs/>
-          <w:b/>
-        </w:rPr>
-        <w:t xml:space="preserve">Per ledger</w:t>
-      </w:r>
-      <w:r>
-        <w:t xml:space="preserve"> </w:t>
-      </w:r>
-      <w:r>
-        <w:t xml:space="preserve">(JV ledger first, then the other ledgers that have the document):</w:t>
       </w:r>
     </w:p>
     <w:p>
@@ -3416,31 +4153,7 @@
         <w:pStyle w:val="Compact"/>
       </w:pPr>
       <w:r>
-        <w:rPr>
-          <w:rStyle w:val="VerbatimChar"/>
-        </w:rPr>
-        <w:t xml:space="preserve">GET_ACDOCA_DOC_LINES</w:t>
-      </w:r>
-      <w:r>
-        <w:t xml:space="preserve"> </w:t>
-      </w:r>
-      <w:r>
-        <w:t xml:space="preserve">/</w:t>
-      </w:r>
-      <w:r>
-        <w:t xml:space="preserve"> </w:t>
-      </w:r>
-      <w:r>
-        <w:rPr>
-          <w:rStyle w:val="VerbatimChar"/>
-        </w:rPr>
-        <w:t xml:space="preserve">PREPARE_ACDOCA_DOCUMENT</w:t>
-      </w:r>
-      <w:r>
-        <w:t xml:space="preserve"> </w:t>
-      </w:r>
-      <w:r>
-        <w:t xml:space="preserve">build the matching ACDOCA document and ACDOCA balances.</w:t>
+        <w:t xml:space="preserve">zero-amount lines</w:t>
       </w:r>
     </w:p>
     <w:p>
@@ -3452,44 +4165,90 @@
         <w:pStyle w:val="Compact"/>
       </w:pPr>
       <w:r>
-        <w:t xml:space="preserve">The program handles migrated documents whose balancing lines were dropped, and repostings</w:t>
-      </w:r>
-      <w:r>
-        <w:t xml:space="preserve"> </w:t>
-      </w:r>
-      <w:r>
-        <w:t xml:space="preserve">(</w:t>
-      </w:r>
-      <w:r>
-        <w:rPr>
-          <w:rStyle w:val="VerbatimChar"/>
-        </w:rPr>
-        <w:t xml:space="preserve">CHECK_FOR_REPOSTINGS_JV/ACDOCA</w:t>
-      </w:r>
-      <w:r>
-        <w:t xml:space="preserve">).</w:t>
+        <w:t xml:space="preserve">balancing lines, if</w:t>
+      </w:r>
+      <w:r>
+        <w:t xml:space="preserve"> </w:t>
+      </w:r>
+      <w:r>
+        <w:rPr>
+          <w:rStyle w:val="VerbatimChar"/>
+        </w:rPr>
+        <w:t xml:space="preserve">P_EXCLBL</w:t>
+      </w:r>
+      <w:r>
+        <w:t xml:space="preserve"> </w:t>
+      </w:r>
+      <w:r>
+        <w:t xml:space="preserve">is set</w:t>
+      </w:r>
+    </w:p>
+    <w:p>
+      <w:pPr>
+        <w:numPr>
+          <w:ilvl w:val="1"/>
+          <w:numId w:val="1007"/>
+        </w:numPr>
+        <w:pStyle w:val="Compact"/>
+      </w:pPr>
+      <w:r>
+        <w:t xml:space="preserve">FI/CO lines without a reference</w:t>
       </w:r>
     </w:p>
     <w:p>
       <w:pPr>
         <w:numPr>
           <w:ilvl w:val="0"/>
-          <w:numId w:val="1005"/>
+          <w:numId w:val="1000"/>
         </w:numPr>
       </w:pPr>
       <w:r>
-        <w:rPr>
-          <w:rStyle w:val="VerbatimChar"/>
+        <w:t xml:space="preserve">For FI/CO documents it also accumulates JV balances (</w:t>
+      </w:r>
+      <w:r>
+        <w:rPr>
+          <w:rStyle w:val="VerbatimChar"/>
+        </w:rPr>
+        <w:t xml:space="preserve">PREPARE_JVSO_BALANCES</w:t>
+      </w:r>
+      <w:r>
+        <w:t xml:space="preserve">).</w:t>
+      </w:r>
+      <w:r>
+        <w:t xml:space="preserve"> </w:t>
+      </w:r>
+      <w:r>
+        <w:rPr>
+          <w:rStyle w:val="VerbatimChar"/>
+        </w:rPr>
+        <w:t xml:space="preserve">DETERMINE_JV_DOC_TYPE</w:t>
+      </w:r>
+      <w:r>
+        <w:t xml:space="preserve"> </w:t>
+      </w:r>
+      <w:r>
+        <w:t xml:space="preserve">sets the document type (FI doc / CO doc) from ACTIV.</w:t>
+      </w:r>
+    </w:p>
+    <w:p>
+      <w:pPr>
+        <w:numPr>
+          <w:ilvl w:val="0"/>
+          <w:numId w:val="1006"/>
+        </w:numPr>
+      </w:pPr>
+      <w:r>
+        <w:rPr>
           <w:bCs/>
           <w:b/>
         </w:rPr>
-        <w:t xml:space="preserve">COMPARE_LINES</w:t>
-      </w:r>
-      <w:r>
-        <w:t xml:space="preserve"> </w:t>
-      </w:r>
-      <w:r>
-        <w:t xml:space="preserve">assigns every JV line to an ACDOCA line:</w:t>
+        <w:t xml:space="preserve">Per ledger</w:t>
+      </w:r>
+      <w:r>
+        <w:t xml:space="preserve"> </w:t>
+      </w:r>
+      <w:r>
+        <w:t xml:space="preserve">(JV ledger first, then the other ledgers that have the document):</w:t>
       </w:r>
     </w:p>
     <w:p>
@@ -3502,25 +4261,105 @@
       </w:pPr>
       <w:r>
         <w:rPr>
-          <w:bCs/>
-          <w:b/>
-        </w:rPr>
-        <w:t xml:space="preserve">By reference</w:t>
-      </w:r>
-      <w:r>
-        <w:t xml:space="preserve"> </w:t>
-      </w:r>
-      <w:r>
-        <w:t xml:space="preserve">(</w:t>
-      </w:r>
-      <w:r>
-        <w:rPr>
-          <w:rStyle w:val="VerbatimChar"/>
-        </w:rPr>
-        <w:t xml:space="preserve">GET_ACDOCA_LINE_BY_REF</w:t>
-      </w:r>
-      <w:r>
-        <w:t xml:space="preserve">): BUZEI = REFFIDLN, then AWITEM, CO_BUZEI = REFDOCLN, the log table, then migrated lines.</w:t>
+          <w:rStyle w:val="VerbatimChar"/>
+        </w:rPr>
+        <w:t xml:space="preserve">GET_ACDOCA_DOC_LINES</w:t>
+      </w:r>
+      <w:r>
+        <w:t xml:space="preserve"> </w:t>
+      </w:r>
+      <w:r>
+        <w:t xml:space="preserve">/</w:t>
+      </w:r>
+      <w:r>
+        <w:t xml:space="preserve"> </w:t>
+      </w:r>
+      <w:r>
+        <w:rPr>
+          <w:rStyle w:val="VerbatimChar"/>
+        </w:rPr>
+        <w:t xml:space="preserve">PREPARE_ACDOCA_DOCUMENT</w:t>
+      </w:r>
+      <w:r>
+        <w:t xml:space="preserve"> </w:t>
+      </w:r>
+      <w:r>
+        <w:t xml:space="preserve">build the matching ACDOCA document and ACDOCA balances:</w:t>
+      </w:r>
+    </w:p>
+    <w:p>
+      <w:pPr>
+        <w:numPr>
+          <w:ilvl w:val="2"/>
+          <w:numId w:val="1009"/>
+        </w:numPr>
+        <w:pStyle w:val="Compact"/>
+      </w:pPr>
+      <w:r>
+        <w:t xml:space="preserve">irrelevant migration lines (MIG_SOURCE set, not 'J'/'G', no venture) are dropped</w:t>
+      </w:r>
+    </w:p>
+    <w:p>
+      <w:pPr>
+        <w:numPr>
+          <w:ilvl w:val="2"/>
+          <w:numId w:val="1009"/>
+        </w:numPr>
+        <w:pStyle w:val="Compact"/>
+      </w:pPr>
+      <w:r>
+        <w:t xml:space="preserve">with</w:t>
+      </w:r>
+      <w:r>
+        <w:t xml:space="preserve"> </w:t>
+      </w:r>
+      <w:r>
+        <w:rPr>
+          <w:rStyle w:val="VerbatimChar"/>
+        </w:rPr>
+        <w:t xml:space="preserve">P_EXCLBL</w:t>
+      </w:r>
+      <w:r>
+        <w:t xml:space="preserve">, venture balancing lines of a real FI document (BSTAT initial) are dropped:</w:t>
+      </w:r>
+      <w:r>
+        <w:t xml:space="preserve"> </w:t>
+      </w:r>
+      <w:r>
+        <w:t xml:space="preserve">lines without BUZEI/CO_BUZEI/AWITEM, or without AWITEM for migrated documents</w:t>
+      </w:r>
+    </w:p>
+    <w:p>
+      <w:pPr>
+        <w:numPr>
+          <w:ilvl w:val="2"/>
+          <w:numId w:val="1009"/>
+        </w:numPr>
+        <w:pStyle w:val="Compact"/>
+      </w:pPr>
+      <w:r>
+        <w:t xml:space="preserve">zero-amount lines are dropped</w:t>
+      </w:r>
+    </w:p>
+    <w:p>
+      <w:pPr>
+        <w:numPr>
+          <w:ilvl w:val="2"/>
+          <w:numId w:val="1009"/>
+        </w:numPr>
+        <w:pStyle w:val="Compact"/>
+      </w:pPr>
+      <w:r>
+        <w:t xml:space="preserve">the JV amounts are derived per ACDOCA line (</w:t>
+      </w:r>
+      <w:r>
+        <w:rPr>
+          <w:rStyle w:val="VerbatimChar"/>
+        </w:rPr>
+        <w:t xml:space="preserve">DETERMINE_JV_AMNTS_IN_ACD_LINE</w:t>
+      </w:r>
+      <w:r>
+        <w:t xml:space="preserve">)</w:t>
       </w:r>
     </w:p>
     <w:p>
@@ -3532,69 +4371,51 @@
         <w:pStyle w:val="Compact"/>
       </w:pPr>
       <w:r>
-        <w:rPr>
+        <w:t xml:space="preserve">The program handles migrated documents whose balancing lines were dropped, and repostings</w:t>
+      </w:r>
+      <w:r>
+        <w:t xml:space="preserve"> </w:t>
+      </w:r>
+      <w:r>
+        <w:t xml:space="preserve">(</w:t>
+      </w:r>
+      <w:r>
+        <w:rPr>
+          <w:rStyle w:val="VerbatimChar"/>
+        </w:rPr>
+        <w:t xml:space="preserve">CHECK_FOR_REPOSTINGS_JV/ACDOCA</w:t>
+      </w:r>
+      <w:r>
+        <w:t xml:space="preserve">).</w:t>
+      </w:r>
+    </w:p>
+    <w:p>
+      <w:pPr>
+        <w:numPr>
+          <w:ilvl w:val="0"/>
+          <w:numId w:val="1006"/>
+        </w:numPr>
+      </w:pPr>
+      <w:r>
+        <w:rPr>
+          <w:rStyle w:val="VerbatimChar"/>
           <w:bCs/>
           <w:b/>
         </w:rPr>
-        <w:t xml:space="preserve">By accounting data</w:t>
-      </w:r>
-      <w:r>
-        <w:t xml:space="preserve"> </w:t>
-      </w:r>
-      <w:r>
-        <w:t xml:space="preserve">(</w:t>
-      </w:r>
-      <w:r>
-        <w:rPr>
-          <w:rStyle w:val="VerbatimChar"/>
-        </w:rPr>
-        <w:t xml:space="preserve">GET_ACDOCA_LINE_BY_ACC_DATA</w:t>
-      </w:r>
-      <w:r>
-        <w:t xml:space="preserve"> </w:t>
-      </w:r>
-      <w:r>
-        <w:t xml:space="preserve">/</w:t>
-      </w:r>
-      <w:r>
-        <w:t xml:space="preserve"> </w:t>
-      </w:r>
-      <w:r>
-        <w:rPr>
-          <w:rStyle w:val="VerbatimChar"/>
-        </w:rPr>
-        <w:t xml:space="preserve">MULTIPLE_ACD_LINE_PROCESSING</w:t>
-      </w:r>
-      <w:r>
-        <w:t xml:space="preserve">):</w:t>
-      </w:r>
-      <w:r>
-        <w:t xml:space="preserve"> </w:t>
-      </w:r>
-      <w:r>
-        <w:t xml:space="preserve">amount, then profit center, venture, equity group, recovery indicator, cost objects, until exactly one line matches.</w:t>
-      </w:r>
-      <w:r>
-        <w:t xml:space="preserve"> </w:t>
-      </w:r>
-      <w:r>
-        <w:t xml:space="preserve">ACDOCA lines may be aggregated (</w:t>
-      </w:r>
-      <w:r>
-        <w:rPr>
-          <w:rStyle w:val="VerbatimChar"/>
-        </w:rPr>
-        <w:t xml:space="preserve">COMPRESS_JV_DOC</w:t>
-      </w:r>
-      <w:r>
-        <w:t xml:space="preserve">).</w:t>
+        <w:t xml:space="preserve">COMPARE_LINES</w:t>
+      </w:r>
+      <w:r>
+        <w:t xml:space="preserve"> </w:t>
+      </w:r>
+      <w:r>
+        <w:t xml:space="preserve">assigns every JV line to an ACDOCA line:</w:t>
       </w:r>
     </w:p>
     <w:p>
       <w:pPr>
         <w:numPr>
           <w:ilvl w:val="1"/>
-          <w:numId w:val="1008"/>
+          <w:numId w:val="1010"/>
         </w:numPr>
         <w:pStyle w:val="Compact"/>
       </w:pPr>
@@ -3603,6 +4424,104 @@
           <w:bCs/>
           <w:b/>
         </w:rPr>
+        <w:t xml:space="preserve">By reference</w:t>
+      </w:r>
+      <w:r>
+        <w:t xml:space="preserve"> </w:t>
+      </w:r>
+      <w:r>
+        <w:t xml:space="preserve">(</w:t>
+      </w:r>
+      <w:r>
+        <w:rPr>
+          <w:rStyle w:val="VerbatimChar"/>
+        </w:rPr>
+        <w:t xml:space="preserve">GET_ACDOCA_LINE_BY_REF</w:t>
+      </w:r>
+      <w:r>
+        <w:t xml:space="preserve">): BUZEI = REFFIDLN, then AWITEM, CO_BUZEI = REFDOCLN, the log table, then migrated lines.</w:t>
+      </w:r>
+    </w:p>
+    <w:p>
+      <w:pPr>
+        <w:numPr>
+          <w:ilvl w:val="1"/>
+          <w:numId w:val="1010"/>
+        </w:numPr>
+        <w:pStyle w:val="Compact"/>
+      </w:pPr>
+      <w:r>
+        <w:rPr>
+          <w:bCs/>
+          <w:b/>
+        </w:rPr>
+        <w:t xml:space="preserve">By accounting data</w:t>
+      </w:r>
+      <w:r>
+        <w:t xml:space="preserve"> </w:t>
+      </w:r>
+      <w:r>
+        <w:t xml:space="preserve">(</w:t>
+      </w:r>
+      <w:r>
+        <w:rPr>
+          <w:rStyle w:val="VerbatimChar"/>
+        </w:rPr>
+        <w:t xml:space="preserve">GET_ACDOCA_LINE_BY_ACC_DATA</w:t>
+      </w:r>
+      <w:r>
+        <w:t xml:space="preserve"> </w:t>
+      </w:r>
+      <w:r>
+        <w:t xml:space="preserve">/</w:t>
+      </w:r>
+      <w:r>
+        <w:t xml:space="preserve"> </w:t>
+      </w:r>
+      <w:r>
+        <w:rPr>
+          <w:rStyle w:val="VerbatimChar"/>
+        </w:rPr>
+        <w:t xml:space="preserve">MULTIPLE_ACD_LINE_PROCESSING</w:t>
+      </w:r>
+      <w:r>
+        <w:t xml:space="preserve">):</w:t>
+      </w:r>
+      <w:r>
+        <w:t xml:space="preserve"> </w:t>
+      </w:r>
+      <w:r>
+        <w:t xml:space="preserve">amount, then profit center, venture, equity group, recovery indicator, cost objects, until exactly one line matches.</w:t>
+      </w:r>
+      <w:r>
+        <w:t xml:space="preserve"> </w:t>
+      </w:r>
+      <w:r>
+        <w:t xml:space="preserve">ACDOCA lines may be aggregated (</w:t>
+      </w:r>
+      <w:r>
+        <w:rPr>
+          <w:rStyle w:val="VerbatimChar"/>
+        </w:rPr>
+        <w:t xml:space="preserve">COMPRESS_JV_DOC</w:t>
+      </w:r>
+      <w:r>
+        <w:t xml:space="preserve">).</w:t>
+      </w:r>
+    </w:p>
+    <w:p>
+      <w:pPr>
+        <w:numPr>
+          <w:ilvl w:val="1"/>
+          <w:numId w:val="1010"/>
+        </w:numPr>
+        <w:pStyle w:val="Compact"/>
+      </w:pPr>
+      <w:r>
+        <w:rPr>
+          <w:bCs/>
+          <w:b/>
+        </w:rPr>
         <w:t xml:space="preserve">Heuristic retry</w:t>
       </w:r>
       <w:r>
@@ -3631,7 +4550,7 @@
       <w:pPr>
         <w:numPr>
           <w:ilvl w:val="0"/>
-          <w:numId w:val="1005"/>
+          <w:numId w:val="1006"/>
         </w:numPr>
       </w:pPr>
       <w:r>
@@ -4132,7 +5051,7 @@
       <w:pPr>
         <w:numPr>
           <w:ilvl w:val="0"/>
-          <w:numId w:val="1005"/>
+          <w:numId w:val="1006"/>
         </w:numPr>
       </w:pPr>
       <w:r>
@@ -4508,7 +5427,7 @@
       <w:pPr>
         <w:numPr>
           <w:ilvl w:val="0"/>
-          <w:numId w:val="1005"/>
+          <w:numId w:val="1006"/>
         </w:numPr>
       </w:pPr>
       <w:r>
@@ -4911,7 +5830,7 @@
       <w:pPr>
         <w:numPr>
           <w:ilvl w:val="1"/>
-          <w:numId w:val="1009"/>
+          <w:numId w:val="1011"/>
         </w:numPr>
         <w:pStyle w:val="Compact"/>
       </w:pPr>
@@ -4927,393 +5846,6 @@
       </w:r>
       <w:r>
         <w:t xml:space="preserve">nothing is called; the issues are listed as warnings.</w:t>
-      </w:r>
-    </w:p>
-    <w:p>
-      <w:pPr>
-        <w:numPr>
-          <w:ilvl w:val="1"/>
-          <w:numId w:val="1009"/>
-        </w:numPr>
-        <w:pStyle w:val="Compact"/>
-      </w:pPr>
-      <w:r>
-        <w:rPr>
-          <w:bCs/>
-          <w:b/>
-        </w:rPr>
-        <w:t xml:space="preserve">Test run:</w:t>
-      </w:r>
-      <w:r>
-        <w:t xml:space="preserve"> </w:t>
-      </w:r>
-      <w:r>
-        <w:t xml:space="preserve">the posting classes are called with</w:t>
-      </w:r>
-      <w:r>
-        <w:t xml:space="preserve"> </w:t>
-      </w:r>
-      <w:r>
-        <w:rPr>
-          <w:rStyle w:val="VerbatimChar"/>
-        </w:rPr>
-        <w:t xml:space="preserve">iv_test = 'X'</w:t>
-      </w:r>
-      <w:r>
-        <w:t xml:space="preserve"> </w:t>
-      </w:r>
-      <w:r>
-        <w:t xml:space="preserve">and the log shows</w:t>
-      </w:r>
-      <w:r>
-        <w:t xml:space="preserve"> </w:t>
-      </w:r>
-      <w:r>
-        <w:rPr>
-          <w:rStyle w:val="VerbatimChar"/>
-        </w:rPr>
-        <w:t xml:space="preserve">BELNR_NEW = 'TEST'</w:t>
-      </w:r>
-      <w:r>
-        <w:t xml:space="preserve">.</w:t>
-      </w:r>
-    </w:p>
-    <w:p>
-      <w:pPr>
-        <w:numPr>
-          <w:ilvl w:val="1"/>
-          <w:numId w:val="1009"/>
-        </w:numPr>
-        <w:pStyle w:val="Compact"/>
-      </w:pPr>
-      <w:r>
-        <w:rPr>
-          <w:bCs/>
-          <w:b/>
-        </w:rPr>
-        <w:t xml:space="preserve">Update:</w:t>
-      </w:r>
-      <w:r>
-        <w:t xml:space="preserve"> </w:t>
-      </w:r>
-      <w:r>
-        <w:t xml:space="preserve">successful corrections go to</w:t>
-      </w:r>
-      <w:r>
-        <w:t xml:space="preserve"> </w:t>
-      </w:r>
-      <w:r>
-        <w:rPr>
-          <w:rStyle w:val="VerbatimChar"/>
-        </w:rPr>
-        <w:t xml:space="preserve">JVA_ACD_UPD_LOG</w:t>
-      </w:r>
-      <w:r>
-        <w:t xml:space="preserve"> </w:t>
-      </w:r>
-      <w:r>
-        <w:t xml:space="preserve">with the old and new BELNR/GJAHR/DOCLN,</w:t>
-      </w:r>
-      <w:r>
-        <w:t xml:space="preserve"> </w:t>
-      </w:r>
-      <w:r>
-        <w:t xml:space="preserve">the reversal document, the issues and the message. The log is written in bulks of</w:t>
-      </w:r>
-      <w:r>
-        <w:t xml:space="preserve"> </w:t>
-      </w:r>
-      <w:r>
-        <w:rPr>
-          <w:rStyle w:val="VerbatimChar"/>
-        </w:rPr>
-        <w:t xml:space="preserve">P_LBULK</w:t>
-      </w:r>
-      <w:r>
-        <w:t xml:space="preserve">,</w:t>
-      </w:r>
-      <w:r>
-        <w:t xml:space="preserve"> </w:t>
-      </w:r>
-      <w:r>
-        <w:t xml:space="preserve">directly or through</w:t>
-      </w:r>
-      <w:r>
-        <w:t xml:space="preserve"> </w:t>
-      </w:r>
-      <w:r>
-        <w:rPr>
-          <w:rStyle w:val="VerbatimChar"/>
-        </w:rPr>
-        <w:t xml:space="preserve">JV_UPDATE_ACD_CORR_LOG</w:t>
-      </w:r>
-      <w:r>
-        <w:t xml:space="preserve"> </w:t>
-      </w:r>
-      <w:r>
-        <w:t xml:space="preserve">in update task, followed by COMMIT WORK.</w:t>
-      </w:r>
-    </w:p>
-    <w:p>
-      <w:pPr>
-        <w:numPr>
-          <w:ilvl w:val="0"/>
-          <w:numId w:val="1005"/>
-        </w:numPr>
-      </w:pPr>
-      <w:r>
-        <w:rPr>
-          <w:bCs/>
-          <w:b/>
-        </w:rPr>
-        <w:t xml:space="preserve">Statistics and output.</w:t>
-      </w:r>
-      <w:r>
-        <w:t xml:space="preserve"> </w:t>
-      </w:r>
-      <w:r>
-        <w:t xml:space="preserve">Document and line statistics are counted: processed, issues, updates and</w:t>
-      </w:r>
-      <w:r>
-        <w:t xml:space="preserve"> </w:t>
-      </w:r>
-      <w:r>
-        <w:t xml:space="preserve">alignment failures. Item info is collected for the ALV output (all lines, updates and errors, or</w:t>
-      </w:r>
-      <w:r>
-        <w:t xml:space="preserve"> </w:t>
-      </w:r>
-      <w:r>
-        <w:t xml:space="preserve">errors only). The results go to an ALV list in dialog, or to a spool per company code or task in</w:t>
-      </w:r>
-      <w:r>
-        <w:t xml:space="preserve"> </w:t>
-      </w:r>
-      <w:r>
-        <w:t xml:space="preserve">background.</w:t>
-      </w:r>
-    </w:p>
-    <w:p>
-      <w:r>
-        <w:pict>
-          <v:rect style="width:0;height:1.5pt" o:hralign="center" o:hrstd="t" o:hr="t"/>
-        </w:pict>
-      </w:r>
-    </w:p>
-    <w:bookmarkEnd w:id="24"/>
-    <w:bookmarkEnd w:id="25"/>
-    <w:bookmarkStart w:id="30" w:name="X9591239ce08bdb88e5246f71e6f0d257ebaa557"/>
-    <w:p>
-      <w:pPr>
-        <w:pStyle w:val="Heading2"/>
-      </w:pPr>
-      <w:r>
-        <w:t xml:space="preserve">5. Creating a Z version – recommendation</w:t>
-      </w:r>
-    </w:p>
-    <w:bookmarkStart w:id="26" w:name="Xdf246d98121108fad8d221b4f3ed2764f5f618c"/>
-    <w:p>
-      <w:pPr>
-        <w:pStyle w:val="Heading3"/>
-      </w:pPr>
-      <w:r>
-        <w:t xml:space="preserve">5.1 What is copyable and what is not</w:t>
-      </w:r>
-    </w:p>
-    <w:p>
-      <w:pPr>
-        <w:numPr>
-          <w:ilvl w:val="0"/>
-          <w:numId w:val="1010"/>
-        </w:numPr>
-      </w:pPr>
-      <w:r>
-        <w:t xml:space="preserve">The</w:t>
-      </w:r>
-      <w:r>
-        <w:t xml:space="preserve"> </w:t>
-      </w:r>
-      <w:r>
-        <w:rPr>
-          <w:bCs/>
-          <w:b/>
-        </w:rPr>
-        <w:t xml:space="preserve">report</w:t>
-      </w:r>
-      <w:r>
-        <w:t xml:space="preserve"> </w:t>
-      </w:r>
-      <w:r>
-        <w:t xml:space="preserve">is a thin shell: selection screen, parameter mapping and three SPTA callback FORMs.</w:t>
-      </w:r>
-      <w:r>
-        <w:t xml:space="preserve"> </w:t>
-      </w:r>
-      <w:r>
-        <w:t xml:space="preserve">It is easy to copy to</w:t>
-      </w:r>
-      <w:r>
-        <w:t xml:space="preserve"> </w:t>
-      </w:r>
-      <w:r>
-        <w:rPr>
-          <w:rStyle w:val="VerbatimChar"/>
-        </w:rPr>
-        <w:t xml:space="preserve">ZRGJV_UPDATE_ACC_DATA_IN_ACDOCA</w:t>
-      </w:r>
-      <w:r>
-        <w:t xml:space="preserve"> </w:t>
-      </w:r>
-      <w:r>
-        <w:t xml:space="preserve">plus a Z transaction (for example</w:t>
-      </w:r>
-      <w:r>
-        <w:t xml:space="preserve"> </w:t>
-      </w:r>
-      <w:r>
-        <w:rPr>
-          <w:rStyle w:val="VerbatimChar"/>
-        </w:rPr>
-        <w:t xml:space="preserve">ZGJMIGACC</w:t>
-      </w:r>
-      <w:r>
-        <w:t xml:space="preserve">).</w:t>
-      </w:r>
-    </w:p>
-    <w:p>
-      <w:pPr>
-        <w:numPr>
-          <w:ilvl w:val="0"/>
-          <w:numId w:val="1010"/>
-        </w:numPr>
-      </w:pPr>
-      <w:r>
-        <w:rPr>
-          <w:rStyle w:val="VerbatimChar"/>
-        </w:rPr>
-        <w:t xml:space="preserve">CL_JVA_MIG_CORRECT_ACDOCA</w:t>
-      </w:r>
-      <w:r>
-        <w:t xml:space="preserve"> </w:t>
-      </w:r>
-      <w:r>
-        <w:t xml:space="preserve">is</w:t>
-      </w:r>
-      <w:r>
-        <w:t xml:space="preserve"> </w:t>
-      </w:r>
-      <w:r>
-        <w:rPr>
-          <w:bCs/>
-          <w:b/>
-        </w:rPr>
-        <w:t xml:space="preserve">FINAL, private instantiation, not released</w:t>
-      </w:r>
-      <w:r>
-        <w:t xml:space="preserve">, and it calls further</w:t>
-      </w:r>
-      <w:r>
-        <w:t xml:space="preserve"> </w:t>
-      </w:r>
-      <w:r>
-        <w:t xml:space="preserve">SAP-internal, non-released classes (</w:t>
-      </w:r>
-      <w:r>
-        <w:rPr>
-          <w:rStyle w:val="VerbatimChar"/>
-        </w:rPr>
-        <w:t xml:space="preserve">CL_JVA_MIG_POST_ACDOCA</w:t>
-      </w:r>
-      <w:r>
-        <w:t xml:space="preserve">,</w:t>
-      </w:r>
-      <w:r>
-        <w:t xml:space="preserve"> </w:t>
-      </w:r>
-      <w:r>
-        <w:rPr>
-          <w:rStyle w:val="VerbatimChar"/>
-        </w:rPr>
-        <w:t xml:space="preserve">CL_JVA_MIG_POST_FI_OP</w:t>
-      </w:r>
-      <w:r>
-        <w:t xml:space="preserve">,</w:t>
-      </w:r>
-      <w:r>
-        <w:t xml:space="preserve"> </w:t>
-      </w:r>
-      <w:r>
-        <w:rPr>
-          <w:rStyle w:val="VerbatimChar"/>
-        </w:rPr>
-        <w:t xml:space="preserve">CL_JVA_MIG_ALV_OUTPUT</w:t>
-      </w:r>
-      <w:r>
-        <w:t xml:space="preserve">,</w:t>
-      </w:r>
-      <w:r>
-        <w:t xml:space="preserve"> </w:t>
-      </w:r>
-      <w:r>
-        <w:rPr>
-          <w:rStyle w:val="VerbatimChar"/>
-        </w:rPr>
-        <w:t xml:space="preserve">CL_JVA_SETTINGS</w:t>
-      </w:r>
-      <w:r>
-        <w:t xml:space="preserve">,</w:t>
-      </w:r>
-      <w:r>
-        <w:t xml:space="preserve"> </w:t>
-      </w:r>
-      <w:r>
-        <w:rPr>
-          <w:rStyle w:val="VerbatimChar"/>
-        </w:rPr>
-        <w:t xml:space="preserve">CL_JVA_UTIL</w:t>
-      </w:r>
-      <w:r>
-        <w:t xml:space="preserve">). These classes</w:t>
-      </w:r>
-      <w:r>
-        <w:t xml:space="preserve"> </w:t>
-      </w:r>
-      <w:r>
-        <w:rPr>
-          <w:bCs/>
-          <w:b/>
-        </w:rPr>
-        <w:t xml:space="preserve">change ACDOCA directly</w:t>
-      </w:r>
-      <w:r>
-        <w:t xml:space="preserve">.</w:t>
-      </w:r>
-    </w:p>
-    <w:p>
-      <w:pPr>
-        <w:numPr>
-          <w:ilvl w:val="0"/>
-          <w:numId w:val="1010"/>
-        </w:numPr>
-      </w:pPr>
-      <w:r>
-        <w:rPr>
-          <w:bCs/>
-          <w:b/>
-        </w:rPr>
-        <w:t xml:space="preserve">The class PDF is incomplete.</w:t>
-      </w:r>
-      <w:r>
-        <w:t xml:space="preserve"> </w:t>
-      </w:r>
-      <w:r>
-        <w:t xml:space="preserve">It only prints the private methods. The interface method</w:t>
-      </w:r>
-      <w:r>
-        <w:t xml:space="preserve"> </w:t>
-      </w:r>
-      <w:r>
-        <w:t xml:space="preserve">implementations are missing:</w:t>
       </w:r>
     </w:p>
     <w:p>
@@ -5326,57 +5858,43 @@
       </w:pPr>
       <w:r>
         <w:rPr>
-          <w:rStyle w:val="VerbatimChar"/>
-        </w:rPr>
-        <w:t xml:space="preserve">IF_JVA_MIG_CORRECT_ACDOCA~EXECUTE_PROCESS</w:t>
-      </w:r>
-      <w:r>
-        <w:t xml:space="preserve"> </w:t>
-      </w:r>
-      <w:r>
-        <w:t xml:space="preserve">(main entry; calls</w:t>
-      </w:r>
-      <w:r>
-        <w:t xml:space="preserve"> </w:t>
-      </w:r>
-      <w:r>
-        <w:rPr>
-          <w:rStyle w:val="VerbatimChar"/>
-        </w:rPr>
-        <w:t xml:space="preserve">GET_GLOBAL_SETTINGS</w:t>
-      </w:r>
-      <w:r>
-        <w:t xml:space="preserve">, decides</w:t>
-      </w:r>
-      <w:r>
-        <w:t xml:space="preserve"> </w:t>
-      </w:r>
-      <w:r>
-        <w:t xml:space="preserve">parallel or synchronous,</w:t>
-      </w:r>
-      <w:r>
-        <w:t xml:space="preserve"> </w:t>
-      </w:r>
-      <w:r>
-        <w:rPr>
-          <w:rStyle w:val="VerbatimChar"/>
-        </w:rPr>
-        <w:t xml:space="preserve">SAVE_RESULTS_GLOBAL</w:t>
-      </w:r>
-      <w:r>
-        <w:t xml:space="preserve">,</w:t>
-      </w:r>
-      <w:r>
-        <w:t xml:space="preserve"> </w:t>
-      </w:r>
-      <w:r>
-        <w:rPr>
-          <w:rStyle w:val="VerbatimChar"/>
-        </w:rPr>
-        <w:t xml:space="preserve">DISPLAY_RESULTS</w:t>
-      </w:r>
-      <w:r>
-        <w:t xml:space="preserve">)</w:t>
+          <w:bCs/>
+          <w:b/>
+        </w:rPr>
+        <w:t xml:space="preserve">Test run:</w:t>
+      </w:r>
+      <w:r>
+        <w:t xml:space="preserve"> </w:t>
+      </w:r>
+      <w:r>
+        <w:t xml:space="preserve">the posting classes are called with</w:t>
+      </w:r>
+      <w:r>
+        <w:t xml:space="preserve"> </w:t>
+      </w:r>
+      <w:r>
+        <w:rPr>
+          <w:rStyle w:val="VerbatimChar"/>
+        </w:rPr>
+        <w:t xml:space="preserve">iv_test = 'X'</w:t>
+      </w:r>
+      <w:r>
+        <w:t xml:space="preserve"> </w:t>
+      </w:r>
+      <w:r>
+        <w:t xml:space="preserve">and the log shows</w:t>
+      </w:r>
+      <w:r>
+        <w:t xml:space="preserve"> </w:t>
+      </w:r>
+      <w:r>
+        <w:rPr>
+          <w:rStyle w:val="VerbatimChar"/>
+        </w:rPr>
+        <w:t xml:space="preserve">BELNR_NEW = 'TEST'</w:t>
+      </w:r>
+      <w:r>
+        <w:t xml:space="preserve">.</w:t>
       </w:r>
     </w:p>
     <w:p>
@@ -5389,9 +5907,46 @@
       </w:pPr>
       <w:r>
         <w:rPr>
-          <w:rStyle w:val="VerbatimChar"/>
-        </w:rPr>
-        <w:t xml:space="preserve">~PARALL_BEFORE_RFC</w:t>
+          <w:bCs/>
+          <w:b/>
+        </w:rPr>
+        <w:t xml:space="preserve">Update:</w:t>
+      </w:r>
+      <w:r>
+        <w:t xml:space="preserve"> </w:t>
+      </w:r>
+      <w:r>
+        <w:t xml:space="preserve">successful corrections go to</w:t>
+      </w:r>
+      <w:r>
+        <w:t xml:space="preserve"> </w:t>
+      </w:r>
+      <w:r>
+        <w:rPr>
+          <w:rStyle w:val="VerbatimChar"/>
+        </w:rPr>
+        <w:t xml:space="preserve">JVA_ACD_UPD_LOG</w:t>
+      </w:r>
+      <w:r>
+        <w:t xml:space="preserve"> </w:t>
+      </w:r>
+      <w:r>
+        <w:t xml:space="preserve">with the old and new BELNR/GJAHR/DOCLN,</w:t>
+      </w:r>
+      <w:r>
+        <w:t xml:space="preserve"> </w:t>
+      </w:r>
+      <w:r>
+        <w:t xml:space="preserve">the reversal document, the issues and the message. The log is written in bulks of</w:t>
+      </w:r>
+      <w:r>
+        <w:t xml:space="preserve"> </w:t>
+      </w:r>
+      <w:r>
+        <w:rPr>
+          <w:rStyle w:val="VerbatimChar"/>
+        </w:rPr>
+        <w:t xml:space="preserve">P_LBULK</w:t>
       </w:r>
       <w:r>
         <w:t xml:space="preserve">,</w:t>
@@ -5400,10 +5955,955 @@
         <w:t xml:space="preserve"> </w:t>
       </w:r>
       <w:r>
-        <w:rPr>
-          <w:rStyle w:val="VerbatimChar"/>
-        </w:rPr>
-        <w:t xml:space="preserve">~PARALL_IN_RFC</w:t>
+        <w:t xml:space="preserve">directly or through</w:t>
+      </w:r>
+      <w:r>
+        <w:t xml:space="preserve"> </w:t>
+      </w:r>
+      <w:r>
+        <w:rPr>
+          <w:rStyle w:val="VerbatimChar"/>
+        </w:rPr>
+        <w:t xml:space="preserve">JV_UPDATE_ACD_CORR_LOG</w:t>
+      </w:r>
+      <w:r>
+        <w:t xml:space="preserve"> </w:t>
+      </w:r>
+      <w:r>
+        <w:t xml:space="preserve">in update task, followed by COMMIT WORK.</w:t>
+      </w:r>
+    </w:p>
+    <w:p>
+      <w:pPr>
+        <w:numPr>
+          <w:ilvl w:val="0"/>
+          <w:numId w:val="1006"/>
+        </w:numPr>
+      </w:pPr>
+      <w:r>
+        <w:rPr>
+          <w:bCs/>
+          <w:b/>
+        </w:rPr>
+        <w:t xml:space="preserve">Statistics and output.</w:t>
+      </w:r>
+      <w:r>
+        <w:t xml:space="preserve"> </w:t>
+      </w:r>
+      <w:r>
+        <w:t xml:space="preserve">Document and line statistics are counted: processed, issues, updates and</w:t>
+      </w:r>
+      <w:r>
+        <w:t xml:space="preserve"> </w:t>
+      </w:r>
+      <w:r>
+        <w:t xml:space="preserve">alignment failures. Item info is collected for the ALV output (all lines, updates and errors, or</w:t>
+      </w:r>
+      <w:r>
+        <w:t xml:space="preserve"> </w:t>
+      </w:r>
+      <w:r>
+        <w:t xml:space="preserve">errors only). The results go to an ALV list in dialog, or to a spool per company code or task in</w:t>
+      </w:r>
+      <w:r>
+        <w:t xml:space="preserve"> </w:t>
+      </w:r>
+      <w:r>
+        <w:t xml:space="preserve">background.</w:t>
+      </w:r>
+    </w:p>
+    <w:bookmarkEnd w:id="26"/>
+    <w:bookmarkStart w:id="27" w:name="X11f19230a899a180433440aa741a483089820e1"/>
+    <w:p>
+      <w:pPr>
+        <w:pStyle w:val="Heading3"/>
+      </w:pPr>
+      <w:r>
+        <w:t xml:space="preserve">4.4 Parallel processing (SPTA)</w:t>
+      </w:r>
+    </w:p>
+    <w:p>
+      <w:pPr>
+        <w:pStyle w:val="FirstParagraph"/>
+      </w:pPr>
+      <w:r>
+        <w:t xml:space="preserve">When</w:t>
+      </w:r>
+      <w:r>
+        <w:t xml:space="preserve"> </w:t>
+      </w:r>
+      <w:r>
+        <w:rPr>
+          <w:rStyle w:val="VerbatimChar"/>
+        </w:rPr>
+        <w:t xml:space="preserve">P_PARALL</w:t>
+      </w:r>
+      <w:r>
+        <w:t xml:space="preserve"> </w:t>
+      </w:r>
+      <w:r>
+        <w:t xml:space="preserve">is set and there is more than one work package:</w:t>
+      </w:r>
+    </w:p>
+    <w:p>
+      <w:pPr>
+        <w:numPr>
+          <w:ilvl w:val="0"/>
+          <w:numId w:val="1012"/>
+        </w:numPr>
+        <w:pStyle w:val="Compact"/>
+      </w:pPr>
+      <w:r>
+        <w:rPr>
+          <w:bCs/>
+          <w:b/>
+        </w:rPr>
+        <w:t xml:space="preserve">Packages.</w:t>
+      </w:r>
+      <w:r>
+        <w:t xml:space="preserve"> </w:t>
+      </w:r>
+      <w:r>
+        <w:rPr>
+          <w:rStyle w:val="VerbatimChar"/>
+        </w:rPr>
+        <w:t xml:space="preserve">CALCULATE_TASK_PACKAGES</w:t>
+      </w:r>
+      <w:r>
+        <w:t xml:space="preserve"> </w:t>
+      </w:r>
+      <w:r>
+        <w:t xml:space="preserve">counts JV documents per company code, year and period</w:t>
+      </w:r>
+      <w:r>
+        <w:t xml:space="preserve"> </w:t>
+      </w:r>
+      <w:r>
+        <w:t xml:space="preserve">(</w:t>
+      </w:r>
+      <w:r>
+        <w:rPr>
+          <w:rStyle w:val="VerbatimChar"/>
+        </w:rPr>
+        <w:t xml:space="preserve">COUNT_JV_DOCUMENTS_BY_PERIOD</w:t>
+      </w:r>
+      <w:r>
+        <w:t xml:space="preserve">). Periods are added to a package until it holds about</w:t>
+      </w:r>
+      <w:r>
+        <w:t xml:space="preserve"> </w:t>
+      </w:r>
+      <w:r>
+        <w:rPr>
+          <w:rStyle w:val="VerbatimChar"/>
+        </w:rPr>
+        <w:t xml:space="preserve">P_DOCTSK</w:t>
+      </w:r>
+      <w:r>
+        <w:t xml:space="preserve"> </w:t>
+      </w:r>
+      <w:r>
+        <w:t xml:space="preserve">documents, with a minimum of 10,000 per package. A task never splits a period. Each package</w:t>
+      </w:r>
+      <w:r>
+        <w:t xml:space="preserve"> </w:t>
+      </w:r>
+      <w:r>
+        <w:t xml:space="preserve">becomes one task with ID</w:t>
+      </w:r>
+      <w:r>
+        <w:t xml:space="preserve"> </w:t>
+      </w:r>
+      <w:r>
+        <w:rPr>
+          <w:rStyle w:val="VerbatimChar"/>
+        </w:rPr>
+        <w:t xml:space="preserve">&lt;company code&gt;_&lt;n&gt;</w:t>
+      </w:r>
+      <w:r>
+        <w:t xml:space="preserve">.</w:t>
+      </w:r>
+    </w:p>
+    <w:p>
+      <w:pPr>
+        <w:numPr>
+          <w:ilvl w:val="0"/>
+          <w:numId w:val="1012"/>
+        </w:numPr>
+        <w:pStyle w:val="Compact"/>
+      </w:pPr>
+      <w:r>
+        <w:rPr>
+          <w:rStyle w:val="VerbatimChar"/>
+          <w:bCs/>
+          <w:b/>
+        </w:rPr>
+        <w:t xml:space="preserve">FORM BEFORE_RFC</w:t>
+      </w:r>
+      <w:r>
+        <w:rPr>
+          <w:bCs/>
+          <w:b/>
+        </w:rPr>
+        <w:t xml:space="preserve"> </w:t>
+      </w:r>
+      <w:r>
+        <w:rPr>
+          <w:bCs/>
+          <w:b/>
+        </w:rPr>
+        <w:t xml:space="preserve">→</w:t>
+      </w:r>
+      <w:r>
+        <w:rPr>
+          <w:bCs/>
+          <w:b/>
+        </w:rPr>
+        <w:t xml:space="preserve"> </w:t>
+      </w:r>
+      <w:r>
+        <w:rPr>
+          <w:rStyle w:val="VerbatimChar"/>
+          <w:bCs/>
+          <w:b/>
+        </w:rPr>
+        <w:t xml:space="preserve">PARALL_BEFORE_RFC</w:t>
+      </w:r>
+      <w:r>
+        <w:t xml:space="preserve"> </w:t>
+      </w:r>
+      <w:r>
+        <w:rPr>
+          <w:iCs/>
+          <w:i/>
+        </w:rPr>
+        <w:t xml:space="preserve">(inferred)</w:t>
+      </w:r>
+      <w:r>
+        <w:t xml:space="preserve">: takes the next task from</w:t>
+      </w:r>
+      <w:r>
+        <w:t xml:space="preserve"> </w:t>
+      </w:r>
+      <w:r>
+        <w:rPr>
+          <w:rStyle w:val="VerbatimChar"/>
+        </w:rPr>
+        <w:t xml:space="preserve">MT_TASKDATA</w:t>
+      </w:r>
+      <w:r>
+        <w:t xml:space="preserve"> </w:t>
+      </w:r>
+      <w:r>
+        <w:t xml:space="preserve">and</w:t>
+      </w:r>
+      <w:r>
+        <w:t xml:space="preserve"> </w:t>
+      </w:r>
+      <w:r>
+        <w:t xml:space="preserve">passes its parameters (company code and periods) to the RFC.</w:t>
+      </w:r>
+    </w:p>
+    <w:p>
+      <w:pPr>
+        <w:numPr>
+          <w:ilvl w:val="0"/>
+          <w:numId w:val="1012"/>
+        </w:numPr>
+        <w:pStyle w:val="Compact"/>
+      </w:pPr>
+      <w:r>
+        <w:rPr>
+          <w:rStyle w:val="VerbatimChar"/>
+          <w:bCs/>
+          <w:b/>
+        </w:rPr>
+        <w:t xml:space="preserve">FORM IN_RFC</w:t>
+      </w:r>
+      <w:r>
+        <w:rPr>
+          <w:bCs/>
+          <w:b/>
+        </w:rPr>
+        <w:t xml:space="preserve"> </w:t>
+      </w:r>
+      <w:r>
+        <w:rPr>
+          <w:bCs/>
+          <w:b/>
+        </w:rPr>
+        <w:t xml:space="preserve">→</w:t>
+      </w:r>
+      <w:r>
+        <w:rPr>
+          <w:bCs/>
+          <w:b/>
+        </w:rPr>
+        <w:t xml:space="preserve"> </w:t>
+      </w:r>
+      <w:r>
+        <w:rPr>
+          <w:rStyle w:val="VerbatimChar"/>
+          <w:bCs/>
+          <w:b/>
+        </w:rPr>
+        <w:t xml:space="preserve">PARALL_IN_RFC</w:t>
+      </w:r>
+      <w:r>
+        <w:t xml:space="preserve"> </w:t>
+      </w:r>
+      <w:r>
+        <w:rPr>
+          <w:iCs/>
+          <w:i/>
+        </w:rPr>
+        <w:t xml:space="preserve">(inferred)</w:t>
+      </w:r>
+      <w:r>
+        <w:t xml:space="preserve">: runs in a separate work process.</w:t>
+      </w:r>
+      <w:r>
+        <w:t xml:space="preserve"> </w:t>
+      </w:r>
+      <w:r>
+        <w:rPr>
+          <w:rStyle w:val="VerbatimChar"/>
+        </w:rPr>
+        <w:t xml:space="preserve">RETRIEVE_JV_DOCUMENTS</w:t>
+      </w:r>
+      <w:r>
+        <w:t xml:space="preserve"> </w:t>
+      </w:r>
+      <w:r>
+        <w:t xml:space="preserve">limits the selection to the package's year/period list.</w:t>
+      </w:r>
+      <w:r>
+        <w:t xml:space="preserve"> </w:t>
+      </w:r>
+      <w:r>
+        <w:rPr>
+          <w:rStyle w:val="VerbatimChar"/>
+        </w:rPr>
+        <w:t xml:space="preserve">PROCESS_COMPANY_CODE</w:t>
+      </w:r>
+      <w:r>
+        <w:t xml:space="preserve"> </w:t>
+      </w:r>
+      <w:r>
+        <w:t xml:space="preserve">then runs the full retrieve, compare and correct cycle and writes</w:t>
+      </w:r>
+      <w:r>
+        <w:t xml:space="preserve"> </w:t>
+      </w:r>
+      <w:r>
+        <w:rPr>
+          <w:rStyle w:val="VerbatimChar"/>
+        </w:rPr>
+        <w:t xml:space="preserve">JVA_ACD_UPD_LOG</w:t>
+      </w:r>
+      <w:r>
+        <w:t xml:space="preserve">. Results and runtimes are returned.</w:t>
+      </w:r>
+    </w:p>
+    <w:p>
+      <w:pPr>
+        <w:numPr>
+          <w:ilvl w:val="0"/>
+          <w:numId w:val="1012"/>
+        </w:numPr>
+        <w:pStyle w:val="Compact"/>
+      </w:pPr>
+      <w:r>
+        <w:rPr>
+          <w:rStyle w:val="VerbatimChar"/>
+          <w:bCs/>
+          <w:b/>
+        </w:rPr>
+        <w:t xml:space="preserve">FORM AFTER_RFC</w:t>
+      </w:r>
+      <w:r>
+        <w:rPr>
+          <w:bCs/>
+          <w:b/>
+        </w:rPr>
+        <w:t xml:space="preserve"> </w:t>
+      </w:r>
+      <w:r>
+        <w:rPr>
+          <w:bCs/>
+          <w:b/>
+        </w:rPr>
+        <w:t xml:space="preserve">→</w:t>
+      </w:r>
+      <w:r>
+        <w:rPr>
+          <w:bCs/>
+          <w:b/>
+        </w:rPr>
+        <w:t xml:space="preserve"> </w:t>
+      </w:r>
+      <w:r>
+        <w:rPr>
+          <w:rStyle w:val="VerbatimChar"/>
+          <w:bCs/>
+          <w:b/>
+        </w:rPr>
+        <w:t xml:space="preserve">PARALL_AFTER_RFC</w:t>
+      </w:r>
+      <w:r>
+        <w:t xml:space="preserve"> </w:t>
+      </w:r>
+      <w:r>
+        <w:rPr>
+          <w:iCs/>
+          <w:i/>
+        </w:rPr>
+        <w:t xml:space="preserve">(inferred)</w:t>
+      </w:r>
+      <w:r>
+        <w:t xml:space="preserve">:</w:t>
+      </w:r>
+      <w:r>
+        <w:t xml:space="preserve"> </w:t>
+      </w:r>
+      <w:r>
+        <w:rPr>
+          <w:rStyle w:val="VerbatimChar"/>
+        </w:rPr>
+        <w:t xml:space="preserve">SAVE_RESULTS</w:t>
+      </w:r>
+      <w:r>
+        <w:t xml:space="preserve"> </w:t>
+      </w:r>
+      <w:r>
+        <w:t xml:space="preserve">merges the task result into its</w:t>
+      </w:r>
+      <w:r>
+        <w:t xml:space="preserve"> </w:t>
+      </w:r>
+      <w:r>
+        <w:t xml:space="preserve">company code (</w:t>
+      </w:r>
+      <w:r>
+        <w:rPr>
+          <w:rStyle w:val="VerbatimChar"/>
+        </w:rPr>
+        <w:t xml:space="preserve">UPDATE_TASK_INFO</w:t>
+      </w:r>
+      <w:r>
+        <w:t xml:space="preserve"> </w:t>
+      </w:r>
+      <w:r>
+        <w:t xml:space="preserve">marks the task returned). Once all tasks of a company code are back,</w:t>
+      </w:r>
+      <w:r>
+        <w:t xml:space="preserve"> </w:t>
+      </w:r>
+      <w:r>
+        <w:t xml:space="preserve">a spool can be printed for it.</w:t>
+      </w:r>
+    </w:p>
+    <w:p>
+      <w:pPr>
+        <w:numPr>
+          <w:ilvl w:val="0"/>
+          <w:numId w:val="1012"/>
+        </w:numPr>
+        <w:pStyle w:val="Compact"/>
+      </w:pPr>
+      <w:r>
+        <w:t xml:space="preserve">SPTA errors (server group not found, no resources) are reported as SHDB_PFW 719, SPTA 005 or FCMLACC 160.</w:t>
+      </w:r>
+    </w:p>
+    <w:p>
+      <w:pPr>
+        <w:pStyle w:val="FirstParagraph"/>
+      </w:pPr>
+      <w:r>
+        <w:t xml:space="preserve">Each task commits its own postings and log entries. A failed task does not roll back the other tasks.</w:t>
+      </w:r>
+    </w:p>
+    <w:p>
+      <w:r>
+        <w:pict>
+          <v:rect style="width:0;height:1.5pt" o:hralign="center" o:hrstd="t" o:hr="t"/>
+        </w:pict>
+      </w:r>
+    </w:p>
+    <w:bookmarkEnd w:id="27"/>
+    <w:bookmarkEnd w:id="28"/>
+    <w:bookmarkStart w:id="31" w:name="Xf3e1f73ad9350a7ef3ac7863986c1590e39bc54"/>
+    <w:p>
+      <w:pPr>
+        <w:pStyle w:val="Heading2"/>
+      </w:pPr>
+      <w:r>
+        <w:t xml:space="preserve">5. Where GJMIGACC fits – related SAP reports and notes</w:t>
+      </w:r>
+    </w:p>
+    <w:p>
+      <w:pPr>
+        <w:pStyle w:val="FirstParagraph"/>
+      </w:pPr>
+      <w:r>
+        <w:t xml:space="preserve">GJMIGACC is one of a set of SAP correction reports for moving to, or switching on, JVA on ACDOCA.</w:t>
+      </w:r>
+      <w:r>
+        <w:t xml:space="preserve"> </w:t>
+      </w:r>
+      <w:r>
+        <w:t xml:space="preserve">Public SAP sources describe it this way:</w:t>
+      </w:r>
+    </w:p>
+    <w:tbl>
+      <w:tblPr>
+        <w:tblStyle w:val="Table"/>
+        <w:tblW w:type="pct" w:w="5000"/>
+        <w:tblLook w:firstRow="1" w:lastRow="0" w:firstColumn="0" w:lastColumn="0" w:noHBand="0" w:noVBand="0" w:val="0020"/>
+        <w:jc w:val="start"/>
+      </w:tblPr>
+      <w:tblGrid>
+        <w:gridCol w:w="3960"/>
+        <w:gridCol w:w="3960"/>
+      </w:tblGrid>
+      <w:tr>
+        <w:trPr>
+          <w:tblHeader w:val="true"/>
+        </w:trPr>
+        <w:tc>
+          <w:tcPr/>
+          <w:p>
+            <w:pPr>
+              <w:pStyle w:val="Compact"/>
+              <w:jc w:val="left"/>
+            </w:pPr>
+            <w:r>
+              <w:t xml:space="preserve">Report / transaction</w:t>
+            </w:r>
+          </w:p>
+        </w:tc>
+        <w:tc>
+          <w:tcPr/>
+          <w:p>
+            <w:pPr>
+              <w:pStyle w:val="Compact"/>
+              <w:jc w:val="left"/>
+            </w:pPr>
+            <w:r>
+              <w:t xml:space="preserve">Purpose</w:t>
+            </w:r>
+          </w:p>
+        </w:tc>
+      </w:tr>
+      <w:tr>
+        <w:tc>
+          <w:tcPr/>
+          <w:p>
+            <w:pPr>
+              <w:pStyle w:val="Compact"/>
+              <w:jc w:val="left"/>
+            </w:pPr>
+            <w:r>
+              <w:rPr>
+                <w:rStyle w:val="VerbatimChar"/>
+              </w:rPr>
+              <w:t xml:space="preserve">RGJV_UPDATE_INT_DOCS_IN_ACDOCA</w:t>
+            </w:r>
+            <w:r>
+              <w:t xml:space="preserve"> </w:t>
+            </w:r>
+            <w:r>
+              <w:t xml:space="preserve">/</w:t>
+            </w:r>
+            <w:r>
+              <w:t xml:space="preserve"> </w:t>
+            </w:r>
+            <w:r>
+              <w:rPr>
+                <w:bCs/>
+                <w:b/>
+              </w:rPr>
+              <w:t xml:space="preserve">GJMIGINT</w:t>
+            </w:r>
+          </w:p>
+        </w:tc>
+        <w:tc>
+          <w:tcPr/>
+          <w:p>
+            <w:pPr>
+              <w:pStyle w:val="Compact"/>
+              <w:jc w:val="left"/>
+            </w:pPr>
+            <w:r>
+              <w:t xml:space="preserve">Creates missing</w:t>
+            </w:r>
+            <w:r>
+              <w:t xml:space="preserve"> </w:t>
+            </w:r>
+            <w:r>
+              <w:rPr>
+                <w:bCs/>
+                <w:b/>
+              </w:rPr>
+              <w:t xml:space="preserve">internal</w:t>
+            </w:r>
+            <w:r>
+              <w:t xml:space="preserve"> </w:t>
+            </w:r>
+            <w:r>
+              <w:t xml:space="preserve">JV documents in ACDOCA (equity change and adjustment, suspense/unsuspense, operator documents such as cutback and cash call). SAP recommends running this</w:t>
+            </w:r>
+            <w:r>
+              <w:t xml:space="preserve"> </w:t>
+            </w:r>
+            <w:r>
+              <w:rPr>
+                <w:bCs/>
+                <w:b/>
+              </w:rPr>
+              <w:t xml:space="preserve">first</w:t>
+            </w:r>
+            <w:r>
+              <w:t xml:space="preserve">.</w:t>
+            </w:r>
+          </w:p>
+        </w:tc>
+      </w:tr>
+      <w:tr>
+        <w:tc>
+          <w:tcPr/>
+          <w:p>
+            <w:pPr>
+              <w:pStyle w:val="Compact"/>
+              <w:jc w:val="left"/>
+            </w:pPr>
+            <w:r>
+              <w:rPr>
+                <w:rStyle w:val="VerbatimChar"/>
+              </w:rPr>
+              <w:t xml:space="preserve">RGJV_UPDATE_ACC_DATA_IN_ACDOCA</w:t>
+            </w:r>
+            <w:r>
+              <w:t xml:space="preserve"> </w:t>
+            </w:r>
+            <w:r>
+              <w:t xml:space="preserve">/</w:t>
+            </w:r>
+            <w:r>
+              <w:t xml:space="preserve"> </w:t>
+            </w:r>
+            <w:r>
+              <w:rPr>
+                <w:bCs/>
+                <w:b/>
+              </w:rPr>
+              <w:t xml:space="preserve">GJMIGACC</w:t>
+            </w:r>
+          </w:p>
+        </w:tc>
+        <w:tc>
+          <w:tcPr/>
+          <w:p>
+            <w:pPr>
+              <w:pStyle w:val="Compact"/>
+              <w:jc w:val="left"/>
+            </w:pPr>
+            <w:r>
+              <w:t xml:space="preserve">Updates ACDOCA with accounting data from the JV ledgers for FI/CO documents, where cost object and JV information differ (this document)</w:t>
+            </w:r>
+          </w:p>
+        </w:tc>
+      </w:tr>
+      <w:tr>
+        <w:tc>
+          <w:tcPr/>
+          <w:p>
+            <w:pPr>
+              <w:pStyle w:val="Compact"/>
+              <w:jc w:val="left"/>
+            </w:pPr>
+            <w:r>
+              <w:rPr>
+                <w:rStyle w:val="VerbatimChar"/>
+              </w:rPr>
+              <w:t xml:space="preserve">RGJV_UPDATE_CBRUNID_IN_ACDOCA</w:t>
+            </w:r>
+          </w:p>
+        </w:tc>
+        <w:tc>
+          <w:tcPr/>
+          <w:p>
+            <w:pPr>
+              <w:pStyle w:val="Compact"/>
+              <w:jc w:val="left"/>
+            </w:pPr>
+            <w:r>
+              <w:t xml:space="preserve">Updates historic ACDOCA data so that cutback does not pick it up again</w:t>
+            </w:r>
+          </w:p>
+        </w:tc>
+      </w:tr>
+    </w:tbl>
+    <w:p>
+      <w:pPr>
+        <w:pStyle w:val="BodyText"/>
+      </w:pPr>
+      <w:r>
+        <w:t xml:space="preserve">This matches the code: GJMIGINT and GJMIGACC share the same class. GJMIGACC switches off the</w:t>
+      </w:r>
+      <w:r>
+        <w:t xml:space="preserve"> </w:t>
+      </w:r>
+      <w:r>
+        <w:t xml:space="preserve">internal-document flags (</w:t>
+      </w:r>
+      <w:r>
+        <w:rPr>
+          <w:rStyle w:val="VerbatimChar"/>
+        </w:rPr>
+        <w:t xml:space="preserve">POST_*</w:t>
+      </w:r>
+      <w:r>
+        <w:t xml:space="preserve">) that GJMIGINT uses.</w:t>
+      </w:r>
+    </w:p>
+    <w:p>
+      <w:pPr>
+        <w:pStyle w:val="BodyText"/>
+      </w:pPr>
+      <w:r>
+        <w:t xml:space="preserve">Prerequisites stated by SAP: New G/L with the G/L splitter and New G/L–JVA integration. The code</w:t>
+      </w:r>
+      <w:r>
+        <w:t xml:space="preserve"> </w:t>
+      </w:r>
+      <w:r>
+        <w:t xml:space="preserve">enforces this with messages G5 826/827 (section 4.0).</w:t>
+      </w:r>
+    </w:p>
+    <w:p>
+      <w:pPr>
+        <w:pStyle w:val="BodyText"/>
+      </w:pPr>
+      <w:r>
+        <w:t xml:space="preserve">SAP Notes to read in SAP for Me (login required; not readable from here):</w:t>
+      </w:r>
+    </w:p>
+    <w:p>
+      <w:pPr>
+        <w:numPr>
+          <w:ilvl w:val="0"/>
+          <w:numId w:val="1013"/>
+        </w:numPr>
+        <w:pStyle w:val="Compact"/>
+      </w:pPr>
+      <w:r>
+        <w:rPr>
+          <w:bCs/>
+          <w:b/>
+        </w:rPr>
+        <w:t xml:space="preserve">3058813</w:t>
+      </w:r>
+      <w:r>
+        <w:t xml:space="preserve"> </w:t>
+      </w:r>
+      <w:r>
+        <w:t xml:space="preserve">– JVA ACDOCA table update reports (documentation of these reports)</w:t>
+      </w:r>
+    </w:p>
+    <w:p>
+      <w:pPr>
+        <w:numPr>
+          <w:ilvl w:val="0"/>
+          <w:numId w:val="1013"/>
+        </w:numPr>
+        <w:pStyle w:val="Compact"/>
+      </w:pPr>
+      <w:r>
+        <w:rPr>
+          <w:bCs/>
+          <w:b/>
+        </w:rPr>
+        <w:t xml:space="preserve">2941622</w:t>
+      </w:r>
+      <w:r>
+        <w:t xml:space="preserve"> </w:t>
+      </w:r>
+      <w:r>
+        <w:t xml:space="preserve">– Disclaimers for migration and switch scenarios to JVA on ACDOCA</w:t>
+      </w:r>
+    </w:p>
+    <w:p>
+      <w:pPr>
+        <w:pStyle w:val="FirstParagraph"/>
+      </w:pPr>
+      <w:r>
+        <w:t xml:space="preserve">Public sources:</w:t>
+      </w:r>
+    </w:p>
+    <w:p>
+      <w:pPr>
+        <w:numPr>
+          <w:ilvl w:val="0"/>
+          <w:numId w:val="1014"/>
+        </w:numPr>
+        <w:pStyle w:val="Compact"/>
+      </w:pPr>
+      <w:hyperlink r:id="rId29">
+        <w:r>
+          <w:rPr>
+            <w:rStyle w:val="Hyperlink"/>
+          </w:rPr>
+          <w:t xml:space="preserve">SAP blog – Migration and Switching to Joint Venture Accounting on ACDOCA (23.03.2022)</w:t>
+        </w:r>
+      </w:hyperlink>
+    </w:p>
+    <w:p>
+      <w:pPr>
+        <w:numPr>
+          <w:ilvl w:val="0"/>
+          <w:numId w:val="1014"/>
+        </w:numPr>
+        <w:pStyle w:val="Compact"/>
+      </w:pPr>
+      <w:hyperlink r:id="rId30">
+        <w:r>
+          <w:rPr>
+            <w:rStyle w:val="Hyperlink"/>
+          </w:rPr>
+          <w:t xml:space="preserve">SAP Help – JVA on ACDOCA</w:t>
+        </w:r>
+      </w:hyperlink>
+    </w:p>
+    <w:p>
+      <w:r>
+        <w:pict>
+          <v:rect style="width:0;height:1.5pt" o:hralign="center" o:hrstd="t" o:hr="t"/>
+        </w:pict>
+      </w:r>
+    </w:p>
+    <w:bookmarkEnd w:id="31"/>
+    <w:bookmarkStart w:id="36" w:name="Xeb15a119a4cda12e4beeefba3772b86def69621"/>
+    <w:p>
+      <w:pPr>
+        <w:pStyle w:val="Heading2"/>
+      </w:pPr>
+      <w:r>
+        <w:t xml:space="preserve">6. Creating a Z version – recommendation</w:t>
+      </w:r>
+    </w:p>
+    <w:bookmarkStart w:id="32" w:name="X9cadaf83f6b783f3db55aba61dc18655f2fdf02"/>
+    <w:p>
+      <w:pPr>
+        <w:pStyle w:val="Heading3"/>
+      </w:pPr>
+      <w:r>
+        <w:t xml:space="preserve">6.1 What is copyable and what is not</w:t>
+      </w:r>
+    </w:p>
+    <w:p>
+      <w:pPr>
+        <w:numPr>
+          <w:ilvl w:val="0"/>
+          <w:numId w:val="1015"/>
+        </w:numPr>
+      </w:pPr>
+      <w:r>
+        <w:t xml:space="preserve">The</w:t>
+      </w:r>
+      <w:r>
+        <w:t xml:space="preserve"> </w:t>
+      </w:r>
+      <w:r>
+        <w:rPr>
+          <w:bCs/>
+          <w:b/>
+        </w:rPr>
+        <w:t xml:space="preserve">report</w:t>
+      </w:r>
+      <w:r>
+        <w:t xml:space="preserve"> </w:t>
+      </w:r>
+      <w:r>
+        <w:t xml:space="preserve">is a thin shell: selection screen, parameter mapping and three SPTA callback FORMs.</w:t>
+      </w:r>
+      <w:r>
+        <w:t xml:space="preserve"> </w:t>
+      </w:r>
+      <w:r>
+        <w:t xml:space="preserve">It is easy to copy to</w:t>
+      </w:r>
+      <w:r>
+        <w:t xml:space="preserve"> </w:t>
+      </w:r>
+      <w:r>
+        <w:rPr>
+          <w:rStyle w:val="VerbatimChar"/>
+        </w:rPr>
+        <w:t xml:space="preserve">ZRGJV_UPDATE_ACC_DATA_IN_ACDOCA</w:t>
+      </w:r>
+      <w:r>
+        <w:t xml:space="preserve"> </w:t>
+      </w:r>
+      <w:r>
+        <w:t xml:space="preserve">plus a Z transaction (for example</w:t>
+      </w:r>
+      <w:r>
+        <w:t xml:space="preserve"> </w:t>
+      </w:r>
+      <w:r>
+        <w:rPr>
+          <w:rStyle w:val="VerbatimChar"/>
+        </w:rPr>
+        <w:t xml:space="preserve">ZGJMIGACC</w:t>
+      </w:r>
+      <w:r>
+        <w:t xml:space="preserve">).</w:t>
+      </w:r>
+    </w:p>
+    <w:p>
+      <w:pPr>
+        <w:numPr>
+          <w:ilvl w:val="0"/>
+          <w:numId w:val="1015"/>
+        </w:numPr>
+      </w:pPr>
+      <w:r>
+        <w:rPr>
+          <w:rStyle w:val="VerbatimChar"/>
+        </w:rPr>
+        <w:t xml:space="preserve">CL_JVA_MIG_CORRECT_ACDOCA</w:t>
+      </w:r>
+      <w:r>
+        <w:t xml:space="preserve"> </w:t>
+      </w:r>
+      <w:r>
+        <w:t xml:space="preserve">is</w:t>
+      </w:r>
+      <w:r>
+        <w:t xml:space="preserve"> </w:t>
+      </w:r>
+      <w:r>
+        <w:rPr>
+          <w:bCs/>
+          <w:b/>
+        </w:rPr>
+        <w:t xml:space="preserve">FINAL, private instantiation, not released</w:t>
+      </w:r>
+      <w:r>
+        <w:t xml:space="preserve">, and it calls further</w:t>
+      </w:r>
+      <w:r>
+        <w:t xml:space="preserve"> </w:t>
+      </w:r>
+      <w:r>
+        <w:t xml:space="preserve">SAP-internal, non-released classes (</w:t>
+      </w:r>
+      <w:r>
+        <w:rPr>
+          <w:rStyle w:val="VerbatimChar"/>
+        </w:rPr>
+        <w:t xml:space="preserve">CL_JVA_MIG_POST_ACDOCA</w:t>
       </w:r>
       <w:r>
         <w:t xml:space="preserve">,</w:t>
@@ -5415,25 +6915,134 @@
         <w:rPr>
           <w:rStyle w:val="VerbatimChar"/>
         </w:rPr>
-        <w:t xml:space="preserve">~PARALL_AFTER_RFC</w:t>
+        <w:t xml:space="preserve">CL_JVA_MIG_POST_FI_OP</w:t>
+      </w:r>
+      <w:r>
+        <w:t xml:space="preserve">,</w:t>
+      </w:r>
+      <w:r>
+        <w:t xml:space="preserve"> </w:t>
+      </w:r>
+      <w:r>
+        <w:rPr>
+          <w:rStyle w:val="VerbatimChar"/>
+        </w:rPr>
+        <w:t xml:space="preserve">CL_JVA_MIG_ALV_OUTPUT</w:t>
+      </w:r>
+      <w:r>
+        <w:t xml:space="preserve">,</w:t>
+      </w:r>
+      <w:r>
+        <w:t xml:space="preserve"> </w:t>
+      </w:r>
+      <w:r>
+        <w:rPr>
+          <w:rStyle w:val="VerbatimChar"/>
+        </w:rPr>
+        <w:t xml:space="preserve">CL_JVA_SETTINGS</w:t>
+      </w:r>
+      <w:r>
+        <w:t xml:space="preserve">,</w:t>
+      </w:r>
+      <w:r>
+        <w:t xml:space="preserve"> </w:t>
+      </w:r>
+      <w:r>
+        <w:rPr>
+          <w:rStyle w:val="VerbatimChar"/>
+        </w:rPr>
+        <w:t xml:space="preserve">CL_JVA_UTIL</w:t>
+      </w:r>
+      <w:r>
+        <w:t xml:space="preserve">). These classes</w:t>
+      </w:r>
+      <w:r>
+        <w:t xml:space="preserve"> </w:t>
+      </w:r>
+      <w:r>
+        <w:rPr>
+          <w:bCs/>
+          <w:b/>
+        </w:rPr>
+        <w:t xml:space="preserve">change ACDOCA directly</w:t>
+      </w:r>
+      <w:r>
+        <w:t xml:space="preserve">.</w:t>
+      </w:r>
+    </w:p>
+    <w:p>
+      <w:pPr>
+        <w:numPr>
+          <w:ilvl w:val="0"/>
+          <w:numId w:val="1015"/>
+        </w:numPr>
+      </w:pPr>
+      <w:r>
+        <w:rPr>
+          <w:bCs/>
+          <w:b/>
+        </w:rPr>
+        <w:t xml:space="preserve">The class PDF is incomplete.</w:t>
+      </w:r>
+      <w:r>
+        <w:t xml:space="preserve"> </w:t>
+      </w:r>
+      <w:r>
+        <w:t xml:space="preserve">It only prints the private methods. The interface method</w:t>
+      </w:r>
+      <w:r>
+        <w:t xml:space="preserve"> </w:t>
+      </w:r>
+      <w:r>
+        <w:t xml:space="preserve">implementations are missing:</w:t>
       </w:r>
     </w:p>
     <w:p>
       <w:pPr>
         <w:numPr>
           <w:ilvl w:val="1"/>
-          <w:numId w:val="1011"/>
+          <w:numId w:val="1016"/>
         </w:numPr>
         <w:pStyle w:val="Compact"/>
       </w:pPr>
       <w:r>
-        <w:t xml:space="preserve">the constant values (</w:t>
-      </w:r>
-      <w:r>
-        <w:rPr>
-          <w:rStyle w:val="VerbatimChar"/>
-        </w:rPr>
-        <w:t xml:space="preserve">GC_CORR_TYPE</w:t>
+        <w:rPr>
+          <w:rStyle w:val="VerbatimChar"/>
+        </w:rPr>
+        <w:t xml:space="preserve">IF_JVA_MIG_CORRECT_ACDOCA~EXECUTE_PROCESS</w:t>
+      </w:r>
+      <w:r>
+        <w:t xml:space="preserve"> </w:t>
+      </w:r>
+      <w:r>
+        <w:t xml:space="preserve">(main entry; calls</w:t>
+      </w:r>
+      <w:r>
+        <w:t xml:space="preserve"> </w:t>
+      </w:r>
+      <w:r>
+        <w:rPr>
+          <w:rStyle w:val="VerbatimChar"/>
+        </w:rPr>
+        <w:t xml:space="preserve">GET_GLOBAL_SETTINGS</w:t>
+      </w:r>
+      <w:r>
+        <w:t xml:space="preserve">, decides</w:t>
+      </w:r>
+      <w:r>
+        <w:t xml:space="preserve"> </w:t>
+      </w:r>
+      <w:r>
+        <w:t xml:space="preserve">parallel or synchronous,</w:t>
+      </w:r>
+      <w:r>
+        <w:t xml:space="preserve"> </w:t>
+      </w:r>
+      <w:r>
+        <w:rPr>
+          <w:rStyle w:val="VerbatimChar"/>
+        </w:rPr>
+        <w:t xml:space="preserve">SAVE_RESULTS_GLOBAL</w:t>
       </w:r>
       <w:r>
         <w:t xml:space="preserve">,</w:t>
@@ -5445,43 +7054,7 @@
         <w:rPr>
           <w:rStyle w:val="VerbatimChar"/>
         </w:rPr>
-        <w:t xml:space="preserve">GC_ISSUE_TYPE</w:t>
-      </w:r>
-      <w:r>
-        <w:t xml:space="preserve">,</w:t>
-      </w:r>
-      <w:r>
-        <w:t xml:space="preserve"> </w:t>
-      </w:r>
-      <w:r>
-        <w:rPr>
-          <w:rStyle w:val="VerbatimChar"/>
-        </w:rPr>
-        <w:t xml:space="preserve">GC_JVLINETYPE</w:t>
-      </w:r>
-      <w:r>
-        <w:t xml:space="preserve">,</w:t>
-      </w:r>
-      <w:r>
-        <w:t xml:space="preserve"> </w:t>
-      </w:r>
-      <w:r>
-        <w:rPr>
-          <w:rStyle w:val="VerbatimChar"/>
-        </w:rPr>
-        <w:t xml:space="preserve">GC_JVDOCTYPE</w:t>
-      </w:r>
-      <w:r>
-        <w:t xml:space="preserve">,</w:t>
-      </w:r>
-      <w:r>
-        <w:t xml:space="preserve"> </w:t>
-      </w:r>
-      <w:r>
-        <w:rPr>
-          <w:rStyle w:val="VerbatimChar"/>
-        </w:rPr>
-        <w:t xml:space="preserve">GC_JVPOSTTYPE</w:t>
+        <w:t xml:space="preserve">DISPLAY_RESULTS</w:t>
       </w:r>
       <w:r>
         <w:t xml:space="preserve">)</w:t>
@@ -5491,7 +7064,115 @@
       <w:pPr>
         <w:numPr>
           <w:ilvl w:val="1"/>
-          <w:numId w:val="1011"/>
+          <w:numId w:val="1016"/>
+        </w:numPr>
+        <w:pStyle w:val="Compact"/>
+      </w:pPr>
+      <w:r>
+        <w:rPr>
+          <w:rStyle w:val="VerbatimChar"/>
+        </w:rPr>
+        <w:t xml:space="preserve">~PARALL_BEFORE_RFC</w:t>
+      </w:r>
+      <w:r>
+        <w:t xml:space="preserve">,</w:t>
+      </w:r>
+      <w:r>
+        <w:t xml:space="preserve"> </w:t>
+      </w:r>
+      <w:r>
+        <w:rPr>
+          <w:rStyle w:val="VerbatimChar"/>
+        </w:rPr>
+        <w:t xml:space="preserve">~PARALL_IN_RFC</w:t>
+      </w:r>
+      <w:r>
+        <w:t xml:space="preserve">,</w:t>
+      </w:r>
+      <w:r>
+        <w:t xml:space="preserve"> </w:t>
+      </w:r>
+      <w:r>
+        <w:rPr>
+          <w:rStyle w:val="VerbatimChar"/>
+        </w:rPr>
+        <w:t xml:space="preserve">~PARALL_AFTER_RFC</w:t>
+      </w:r>
+    </w:p>
+    <w:p>
+      <w:pPr>
+        <w:numPr>
+          <w:ilvl w:val="1"/>
+          <w:numId w:val="1016"/>
+        </w:numPr>
+        <w:pStyle w:val="Compact"/>
+      </w:pPr>
+      <w:r>
+        <w:t xml:space="preserve">the constant values (</w:t>
+      </w:r>
+      <w:r>
+        <w:rPr>
+          <w:rStyle w:val="VerbatimChar"/>
+        </w:rPr>
+        <w:t xml:space="preserve">GC_CORR_TYPE</w:t>
+      </w:r>
+      <w:r>
+        <w:t xml:space="preserve">,</w:t>
+      </w:r>
+      <w:r>
+        <w:t xml:space="preserve"> </w:t>
+      </w:r>
+      <w:r>
+        <w:rPr>
+          <w:rStyle w:val="VerbatimChar"/>
+        </w:rPr>
+        <w:t xml:space="preserve">GC_ISSUE_TYPE</w:t>
+      </w:r>
+      <w:r>
+        <w:t xml:space="preserve">,</w:t>
+      </w:r>
+      <w:r>
+        <w:t xml:space="preserve"> </w:t>
+      </w:r>
+      <w:r>
+        <w:rPr>
+          <w:rStyle w:val="VerbatimChar"/>
+        </w:rPr>
+        <w:t xml:space="preserve">GC_JVLINETYPE</w:t>
+      </w:r>
+      <w:r>
+        <w:t xml:space="preserve">,</w:t>
+      </w:r>
+      <w:r>
+        <w:t xml:space="preserve"> </w:t>
+      </w:r>
+      <w:r>
+        <w:rPr>
+          <w:rStyle w:val="VerbatimChar"/>
+        </w:rPr>
+        <w:t xml:space="preserve">GC_JVDOCTYPE</w:t>
+      </w:r>
+      <w:r>
+        <w:t xml:space="preserve">,</w:t>
+      </w:r>
+      <w:r>
+        <w:t xml:space="preserve"> </w:t>
+      </w:r>
+      <w:r>
+        <w:rPr>
+          <w:rStyle w:val="VerbatimChar"/>
+        </w:rPr>
+        <w:t xml:space="preserve">GC_JVPOSTTYPE</w:t>
+      </w:r>
+      <w:r>
+        <w:t xml:space="preserve">)</w:t>
+      </w:r>
+    </w:p>
+    <w:p>
+      <w:pPr>
+        <w:numPr>
+          <w:ilvl w:val="1"/>
+          <w:numId w:val="1016"/>
         </w:numPr>
         <w:pStyle w:val="Compact"/>
       </w:pPr>
@@ -5509,15 +7190,219 @@
       <w:r>
         <w:t xml:space="preserve">A full class copy needs these taken from SE24/SE80 in OCP (or a full abapGit export), not from the PDF.</w:t>
       </w:r>
-    </w:p>
-    <w:bookmarkEnd w:id="26"/>
-    <w:bookmarkStart w:id="27" w:name="X8b076d9f72a18ede52306e605d8c6be3f359055"/>
+      <w:r>
+        <w:t xml:space="preserve"> </w:t>
+      </w:r>
+      <w:r>
+        <w:rPr>
+          <w:rStyle w:val="VerbatimChar"/>
+        </w:rPr>
+        <w:t xml:space="preserve">GJMIGACC_c_lass_1.pdf</w:t>
+      </w:r>
+      <w:r>
+        <w:t xml:space="preserve"> </w:t>
+      </w:r>
+      <w:r>
+        <w:t xml:space="preserve">is a re-print of the same class and also lacks them. The SE24 print</w:t>
+      </w:r>
+      <w:r>
+        <w:t xml:space="preserve"> </w:t>
+      </w:r>
+      <w:r>
+        <w:t xml:space="preserve">function does not output interface method implementations. To get them:</w:t>
+      </w:r>
+    </w:p>
+    <w:p>
+      <w:pPr>
+        <w:numPr>
+          <w:ilvl w:val="1"/>
+          <w:numId w:val="1017"/>
+        </w:numPr>
+        <w:pStyle w:val="Compact"/>
+      </w:pPr>
+      <w:r>
+        <w:t xml:space="preserve">SE24 →</w:t>
+      </w:r>
+      <w:r>
+        <w:t xml:space="preserve"> </w:t>
+      </w:r>
+      <w:r>
+        <w:rPr>
+          <w:rStyle w:val="VerbatimChar"/>
+        </w:rPr>
+        <w:t xml:space="preserve">CL_JVA_MIG_CORRECT_ACDOCA</w:t>
+      </w:r>
+      <w:r>
+        <w:t xml:space="preserve"> </w:t>
+      </w:r>
+      <w:r>
+        <w:t xml:space="preserve">→</w:t>
+      </w:r>
+      <w:r>
+        <w:t xml:space="preserve"> </w:t>
+      </w:r>
+      <w:r>
+        <w:rPr>
+          <w:bCs/>
+          <w:b/>
+        </w:rPr>
+        <w:t xml:space="preserve">Source Code-Based</w:t>
+      </w:r>
+      <w:r>
+        <w:t xml:space="preserve"> </w:t>
+      </w:r>
+      <w:r>
+        <w:t xml:space="preserve">button → copy all, then save as</w:t>
+      </w:r>
+      <w:r>
+        <w:t xml:space="preserve"> </w:t>
+      </w:r>
+      <w:r>
+        <w:rPr>
+          <w:rStyle w:val="VerbatimChar"/>
+        </w:rPr>
+        <w:t xml:space="preserve">.txt</w:t>
+      </w:r>
+      <w:r>
+        <w:t xml:space="preserve">; or</w:t>
+      </w:r>
+    </w:p>
+    <w:p>
+      <w:pPr>
+        <w:numPr>
+          <w:ilvl w:val="1"/>
+          <w:numId w:val="1017"/>
+        </w:numPr>
+        <w:pStyle w:val="Compact"/>
+      </w:pPr>
+      <w:r>
+        <w:t xml:space="preserve">SE38 → display include</w:t>
+      </w:r>
+      <w:r>
+        <w:t xml:space="preserve"> </w:t>
+      </w:r>
+      <w:r>
+        <w:rPr>
+          <w:rStyle w:val="VerbatimChar"/>
+        </w:rPr>
+        <w:t xml:space="preserve">CL_JVA_MIG_CORRECT_ACDOCA=====CU</w:t>
+      </w:r>
+      <w:r>
+        <w:t xml:space="preserve">/</w:t>
+      </w:r>
+      <w:r>
+        <w:rPr>
+          <w:rStyle w:val="VerbatimChar"/>
+        </w:rPr>
+        <w:t xml:space="preserve">CO</w:t>
+      </w:r>
+      <w:r>
+        <w:t xml:space="preserve">/</w:t>
+      </w:r>
+      <w:r>
+        <w:rPr>
+          <w:rStyle w:val="VerbatimChar"/>
+        </w:rPr>
+        <w:t xml:space="preserve">CI</w:t>
+      </w:r>
+      <w:r>
+        <w:t xml:space="preserve"> </w:t>
+      </w:r>
+      <w:r>
+        <w:t xml:space="preserve">(definitions) and the method</w:t>
+      </w:r>
+      <w:r>
+        <w:t xml:space="preserve"> </w:t>
+      </w:r>
+      <w:r>
+        <w:t xml:space="preserve">includes</w:t>
+      </w:r>
+      <w:r>
+        <w:t xml:space="preserve"> </w:t>
+      </w:r>
+      <w:r>
+        <w:rPr>
+          <w:rStyle w:val="VerbatimChar"/>
+        </w:rPr>
+        <w:t xml:space="preserve">...CM0nn</w:t>
+      </w:r>
+      <w:r>
+        <w:t xml:space="preserve">. The class pool is</w:t>
+      </w:r>
+      <w:r>
+        <w:t xml:space="preserve"> </w:t>
+      </w:r>
+      <w:r>
+        <w:rPr>
+          <w:rStyle w:val="VerbatimChar"/>
+        </w:rPr>
+        <w:t xml:space="preserve">CL_JVA_MIG_CORRECT_ACDOCA=====CP</w:t>
+      </w:r>
+      <w:r>
+        <w:t xml:space="preserve">; or</w:t>
+      </w:r>
+    </w:p>
+    <w:p>
+      <w:pPr>
+        <w:numPr>
+          <w:ilvl w:val="1"/>
+          <w:numId w:val="1017"/>
+        </w:numPr>
+        <w:pStyle w:val="Compact"/>
+      </w:pPr>
+      <w:r>
+        <w:t xml:space="preserve">export the class with abapGit.</w:t>
+      </w:r>
+    </w:p>
+    <w:p>
+      <w:pPr>
+        <w:numPr>
+          <w:ilvl w:val="0"/>
+          <w:numId w:val="1000"/>
+        </w:numPr>
+      </w:pPr>
+      <w:r>
+        <w:t xml:space="preserve">Also needed: interface</w:t>
+      </w:r>
+      <w:r>
+        <w:t xml:space="preserve"> </w:t>
+      </w:r>
+      <w:r>
+        <w:rPr>
+          <w:rStyle w:val="VerbatimChar"/>
+        </w:rPr>
+        <w:t xml:space="preserve">IF_JVA_MIG_CORRECT_ACDOCA</w:t>
+      </w:r>
+      <w:r>
+        <w:t xml:space="preserve"> </w:t>
+      </w:r>
+      <w:r>
+        <w:t xml:space="preserve">(parameter structure, package types), the class</w:t>
+      </w:r>
+      <w:r>
+        <w:t xml:space="preserve"> </w:t>
+      </w:r>
+      <w:r>
+        <w:t xml:space="preserve">constants (</w:t>
+      </w:r>
+      <w:r>
+        <w:rPr>
+          <w:rStyle w:val="VerbatimChar"/>
+        </w:rPr>
+        <w:t xml:space="preserve">GC_*</w:t>
+      </w:r>
+      <w:r>
+        <w:t xml:space="preserve">) and the text pool.</w:t>
+      </w:r>
+    </w:p>
+    <w:bookmarkEnd w:id="32"/>
+    <w:bookmarkStart w:id="33" w:name="X920e48081d137fcb6106638d540467ae7b97939"/>
     <w:p>
       <w:pPr>
         <w:pStyle w:val="Heading3"/>
       </w:pPr>
       <w:r>
-        <w:t xml:space="preserve">5.2 Options</w:t>
+        <w:t xml:space="preserve">6.2 Options</w:t>
       </w:r>
     </w:p>
     <w:tbl>
@@ -5840,21 +7725,21 @@
         </w:tc>
       </w:tr>
     </w:tbl>
-    <w:bookmarkEnd w:id="27"/>
-    <w:bookmarkStart w:id="28" w:name="X4e718d95d21856f0ecc7cac8311879bdd419b8e"/>
+    <w:bookmarkEnd w:id="33"/>
+    <w:bookmarkStart w:id="34" w:name="X32f20cade48ccb102c51188d43d30a232132c1f"/>
     <w:p>
       <w:pPr>
         <w:pStyle w:val="Heading3"/>
       </w:pPr>
       <w:r>
-        <w:t xml:space="preserve">5.3 Steps for option A (and the base for option B)</w:t>
+        <w:t xml:space="preserve">6.3 Steps for option A (and the base for option B)</w:t>
       </w:r>
     </w:p>
     <w:p>
       <w:pPr>
         <w:numPr>
           <w:ilvl w:val="0"/>
-          <w:numId w:val="1012"/>
+          <w:numId w:val="1018"/>
         </w:numPr>
         <w:pStyle w:val="Compact"/>
       </w:pPr>
@@ -5896,7 +7781,7 @@
       <w:pPr>
         <w:numPr>
           <w:ilvl w:val="0"/>
-          <w:numId w:val="1012"/>
+          <w:numId w:val="1018"/>
         </w:numPr>
         <w:pStyle w:val="Compact"/>
       </w:pPr>
@@ -5920,7 +7805,7 @@
       <w:pPr>
         <w:numPr>
           <w:ilvl w:val="0"/>
-          <w:numId w:val="1012"/>
+          <w:numId w:val="1018"/>
         </w:numPr>
         <w:pStyle w:val="Compact"/>
       </w:pPr>
@@ -5989,7 +7874,7 @@
       <w:pPr>
         <w:numPr>
           <w:ilvl w:val="0"/>
-          <w:numId w:val="1012"/>
+          <w:numId w:val="1018"/>
         </w:numPr>
         <w:pStyle w:val="Compact"/>
       </w:pPr>
@@ -6001,7 +7886,7 @@
       <w:pPr>
         <w:numPr>
           <w:ilvl w:val="0"/>
-          <w:numId w:val="1012"/>
+          <w:numId w:val="1018"/>
         </w:numPr>
         <w:pStyle w:val="Compact"/>
       </w:pPr>
@@ -6049,7 +7934,7 @@
       <w:pPr>
         <w:numPr>
           <w:ilvl w:val="0"/>
-          <w:numId w:val="1012"/>
+          <w:numId w:val="1018"/>
         </w:numPr>
         <w:pStyle w:val="Compact"/>
       </w:pPr>
@@ -6061,7 +7946,7 @@
       <w:pPr>
         <w:numPr>
           <w:ilvl w:val="1"/>
-          <w:numId w:val="1013"/>
+          <w:numId w:val="1019"/>
         </w:numPr>
         <w:pStyle w:val="Compact"/>
       </w:pPr>
@@ -6124,7 +8009,7 @@
       <w:pPr>
         <w:numPr>
           <w:ilvl w:val="1"/>
-          <w:numId w:val="1013"/>
+          <w:numId w:val="1019"/>
         </w:numPr>
         <w:pStyle w:val="Compact"/>
       </w:pPr>
@@ -6156,12 +8041,30 @@
     <w:p>
       <w:pPr>
         <w:numPr>
-          <w:ilvl w:val="0"/>
-          <w:numId w:val="1012"/>
+          <w:ilvl w:val="1"/>
+          <w:numId w:val="1019"/>
         </w:numPr>
         <w:pStyle w:val="Compact"/>
       </w:pPr>
       <w:r>
+        <w:t xml:space="preserve">Keep the system prerequisites in 4.0 in mind for the test system: document splitting with VNAME</w:t>
+      </w:r>
+      <w:r>
+        <w:t xml:space="preserve"> </w:t>
+      </w:r>
+      <w:r>
+        <w:t xml:space="preserve">must be active, otherwise the Z report stops with G5 826/827 just like the standard one.</w:t>
+      </w:r>
+    </w:p>
+    <w:p>
+      <w:pPr>
+        <w:numPr>
+          <w:ilvl w:val="0"/>
+          <w:numId w:val="1018"/>
+        </w:numPr>
+        <w:pStyle w:val="Compact"/>
+      </w:pPr>
+      <w:r>
         <w:t xml:space="preserve">Test in this order: analysis → test run → update on a small company code and period, using the</w:t>
       </w:r>
       <w:r>
@@ -6190,21 +8093,21 @@
         <w:t xml:space="preserve">.</w:t>
       </w:r>
     </w:p>
-    <w:bookmarkEnd w:id="28"/>
-    <w:bookmarkStart w:id="29" w:name="Xdacac1ec7c8753a8c39f379daaf9478b939860a"/>
+    <w:bookmarkEnd w:id="34"/>
+    <w:bookmarkStart w:id="35" w:name="X7295e12c54909d66407fdd30e4998ad5c1c2f7e"/>
     <w:p>
       <w:pPr>
         <w:pStyle w:val="Heading3"/>
       </w:pPr>
       <w:r>
-        <w:t xml:space="preserve">5.4 Open points for the customer</w:t>
+        <w:t xml:space="preserve">6.4 Open points for the customer</w:t>
       </w:r>
     </w:p>
     <w:p>
       <w:pPr>
         <w:numPr>
           <w:ilvl w:val="0"/>
-          <w:numId w:val="1014"/>
+          <w:numId w:val="1020"/>
         </w:numPr>
         <w:pStyle w:val="Compact"/>
       </w:pPr>
@@ -6216,35 +8119,62 @@
       <w:pPr>
         <w:numPr>
           <w:ilvl w:val="0"/>
-          <w:numId w:val="1014"/>
+          <w:numId w:val="1020"/>
         </w:numPr>
         <w:pStyle w:val="Compact"/>
       </w:pPr>
       <w:r>
-        <w:t xml:space="preserve">If option B: provide the full class source (abapGit/SE24 export) including the interface methods,</w:t>
-      </w:r>
-      <w:r>
-        <w:t xml:space="preserve"> </w:t>
-      </w:r>
-      <w:r>
-        <w:t xml:space="preserve">constants and text pool, because the PDF does not contain them.</w:t>
+        <w:t xml:space="preserve">If option B: provide the full class source (abapGit, or the SE24 source-code-based view) including</w:t>
+      </w:r>
+      <w:r>
+        <w:t xml:space="preserve"> </w:t>
+      </w:r>
+      <w:r>
+        <w:t xml:space="preserve">the interface methods, constants and text pool. Neither class PDF contains them.</w:t>
       </w:r>
     </w:p>
     <w:p>
       <w:pPr>
         <w:numPr>
           <w:ilvl w:val="0"/>
-          <w:numId w:val="1014"/>
+          <w:numId w:val="1020"/>
         </w:numPr>
         <w:pStyle w:val="Compact"/>
       </w:pPr>
       <w:r>
+        <w:t xml:space="preserve">Confirm whether GJMIGINT (</w:t>
+      </w:r>
+      <w:r>
+        <w:rPr>
+          <w:rStyle w:val="VerbatimChar"/>
+        </w:rPr>
+        <w:t xml:space="preserve">RGJV_UPDATE_INT_DOCS_IN_ACDOCA</w:t>
+      </w:r>
+      <w:r>
+        <w:t xml:space="preserve">) has already been run in OCP.</w:t>
+      </w:r>
+      <w:r>
+        <w:t xml:space="preserve"> </w:t>
+      </w:r>
+      <w:r>
+        <w:t xml:space="preserve">SAP recommends running it before GJMIGACC.</w:t>
+      </w:r>
+    </w:p>
+    <w:p>
+      <w:pPr>
+        <w:numPr>
+          <w:ilvl w:val="0"/>
+          <w:numId w:val="1020"/>
+        </w:numPr>
+        <w:pStyle w:val="Compact"/>
+      </w:pPr>
+      <w:r>
         <w:t xml:space="preserve">Confirm who may run update mode. Update mode posts or changes ACDOCA, so it should be restricted.</w:t>
       </w:r>
     </w:p>
-    <w:bookmarkEnd w:id="29"/>
-    <w:bookmarkEnd w:id="30"/>
-    <w:bookmarkEnd w:id="31"/>
+    <w:bookmarkEnd w:id="35"/>
+    <w:bookmarkEnd w:id="36"/>
+    <w:bookmarkEnd w:id="37"/>
     <w:sectPr/>
   </w:body>
 </w:document>
@@ -6582,6 +8512,9 @@
     <w:abstractNumId w:val="991"/>
   </w:num>
   <w:num w:numId="1005">
+    <w:abstractNumId w:val="991"/>
+  </w:num>
+  <w:num w:numId="1006">
     <w:abstractNumId w:val="99411"/>
     <w:lvlOverride w:ilvl="0">
       <w:startOverride w:val="1"/>
@@ -6610,9 +8543,6 @@
     <w:lvlOverride w:ilvl="8">
       <w:startOverride w:val="1"/>
     </w:lvlOverride>
-  </w:num>
-  <w:num w:numId="1006">
-    <w:abstractNumId w:val="991"/>
   </w:num>
   <w:num w:numId="1007">
     <w:abstractNumId w:val="991"/>
@@ -6663,6 +8593,51 @@
     <w:abstractNumId w:val="991"/>
   </w:num>
   <w:num w:numId="1014">
+    <w:abstractNumId w:val="991"/>
+  </w:num>
+  <w:num w:numId="1015">
+    <w:abstractNumId w:val="991"/>
+  </w:num>
+  <w:num w:numId="1016">
+    <w:abstractNumId w:val="991"/>
+  </w:num>
+  <w:num w:numId="1017">
+    <w:abstractNumId w:val="991"/>
+  </w:num>
+  <w:num w:numId="1018">
+    <w:abstractNumId w:val="99411"/>
+    <w:lvlOverride w:ilvl="0">
+      <w:startOverride w:val="1"/>
+    </w:lvlOverride>
+    <w:lvlOverride w:ilvl="1">
+      <w:startOverride w:val="1"/>
+    </w:lvlOverride>
+    <w:lvlOverride w:ilvl="2">
+      <w:startOverride w:val="1"/>
+    </w:lvlOverride>
+    <w:lvlOverride w:ilvl="3">
+      <w:startOverride w:val="1"/>
+    </w:lvlOverride>
+    <w:lvlOverride w:ilvl="4">
+      <w:startOverride w:val="1"/>
+    </w:lvlOverride>
+    <w:lvlOverride w:ilvl="5">
+      <w:startOverride w:val="1"/>
+    </w:lvlOverride>
+    <w:lvlOverride w:ilvl="6">
+      <w:startOverride w:val="1"/>
+    </w:lvlOverride>
+    <w:lvlOverride w:ilvl="7">
+      <w:startOverride w:val="1"/>
+    </w:lvlOverride>
+    <w:lvlOverride w:ilvl="8">
+      <w:startOverride w:val="1"/>
+    </w:lvlOverride>
+  </w:num>
+  <w:num w:numId="1019">
+    <w:abstractNumId w:val="991"/>
+  </w:num>
+  <w:num w:numId="1020">
     <w:abstractNumId w:val="99411"/>
     <w:lvlOverride w:ilvl="0">
       <w:startOverride w:val="1"/>

</xml_diff>